<commit_message>
Quitar valor de demostración visible y separar el hallazgo de respaldos (H7)
</commit_message>
<xml_diff>
--- a/docs/Entrega_Final_Fiver_Cable.docx
+++ b/docs/Entrega_Final_Fiver_Cable.docx
@@ -481,7 +481,7 @@
       <w:pPr>
         <w:pStyle w:val="Ttulo1"/>
       </w:pPr>
-      <w:bookmarkStart w:id="0" w:name="_Toc242548958"/>
+      <w:bookmarkStart w:id="0" w:name="_Toc242550807"/>
       <w:r>
         <w:t>Presentación del documento</w:t>
       </w:r>
@@ -533,7 +533,7 @@
     <w:sdt>
       <w:sdtPr>
         <w:alias w:val="Contenido"/>
-        <w:id w:val="-94095005"/>
+        <w:id w:val="540403904"/>
       </w:sdtPr>
       <w:sdtEndPr/>
       <w:sdtContent>
@@ -556,7 +556,7 @@
           <w:r>
             <w:fldChar w:fldCharType="separate"/>
           </w:r>
-          <w:hyperlink w:anchor="_Toc242548958" w:history="1">
+          <w:hyperlink w:anchor="_Toc242550807" w:history="1">
             <w:r>
               <w:rPr>
                 <w:rStyle w:val="Hipervnculo"/>
@@ -580,7 +580,7 @@
               <w:rPr>
                 <w:noProof/>
               </w:rPr>
-              <w:instrText xml:space="preserve"> PAGEREF _Toc242548958 \h </w:instrText>
+              <w:instrText xml:space="preserve"> PAGEREF _Toc242550807 \h </w:instrText>
             </w:r>
             <w:r>
               <w:rPr>
@@ -617,7 +617,7 @@
               <w:noProof/>
             </w:rPr>
           </w:pPr>
-          <w:hyperlink w:anchor="_Toc242548959" w:history="1">
+          <w:hyperlink w:anchor="_Toc242550808" w:history="1">
             <w:r>
               <w:rPr>
                 <w:rStyle w:val="Hipervnculo"/>
@@ -641,7 +641,7 @@
               <w:rPr>
                 <w:noProof/>
               </w:rPr>
-              <w:instrText xml:space="preserve"> PAGEREF _Toc242548959 \h </w:instrText>
+              <w:instrText xml:space="preserve"> PAGEREF _Toc242550808 \h </w:instrText>
             </w:r>
             <w:r>
               <w:rPr>
@@ -678,7 +678,7 @@
               <w:noProof/>
             </w:rPr>
           </w:pPr>
-          <w:hyperlink w:anchor="_Toc242548960" w:history="1">
+          <w:hyperlink w:anchor="_Toc242550809" w:history="1">
             <w:r>
               <w:rPr>
                 <w:rStyle w:val="Hipervnculo"/>
@@ -702,7 +702,7 @@
               <w:rPr>
                 <w:noProof/>
               </w:rPr>
-              <w:instrText xml:space="preserve"> PAGEREF _Toc242548960 \h </w:instrText>
+              <w:instrText xml:space="preserve"> PAGEREF _Toc242550809 \h </w:instrText>
             </w:r>
             <w:r>
               <w:rPr>
@@ -739,7 +739,7 @@
               <w:noProof/>
             </w:rPr>
           </w:pPr>
-          <w:hyperlink w:anchor="_Toc242548961" w:history="1">
+          <w:hyperlink w:anchor="_Toc242550810" w:history="1">
             <w:r>
               <w:rPr>
                 <w:rStyle w:val="Hipervnculo"/>
@@ -763,7 +763,7 @@
               <w:rPr>
                 <w:noProof/>
               </w:rPr>
-              <w:instrText xml:space="preserve"> PAGEREF _Toc242548961 \h </w:instrText>
+              <w:instrText xml:space="preserve"> PAGEREF _Toc242550810 \h </w:instrText>
             </w:r>
             <w:r>
               <w:rPr>
@@ -800,7 +800,7 @@
               <w:noProof/>
             </w:rPr>
           </w:pPr>
-          <w:hyperlink w:anchor="_Toc242548962" w:history="1">
+          <w:hyperlink w:anchor="_Toc242550811" w:history="1">
             <w:r>
               <w:rPr>
                 <w:rStyle w:val="Hipervnculo"/>
@@ -824,7 +824,7 @@
               <w:rPr>
                 <w:noProof/>
               </w:rPr>
-              <w:instrText xml:space="preserve"> PAGEREF _Toc242548962 \h </w:instrText>
+              <w:instrText xml:space="preserve"> PAGEREF _Toc242550811 \h </w:instrText>
             </w:r>
             <w:r>
               <w:rPr>
@@ -861,7 +861,7 @@
               <w:noProof/>
             </w:rPr>
           </w:pPr>
-          <w:hyperlink w:anchor="_Toc242548963" w:history="1">
+          <w:hyperlink w:anchor="_Toc242550812" w:history="1">
             <w:r>
               <w:rPr>
                 <w:rStyle w:val="Hipervnculo"/>
@@ -885,7 +885,7 @@
               <w:rPr>
                 <w:noProof/>
               </w:rPr>
-              <w:instrText xml:space="preserve"> PAGEREF _Toc242548963 \h </w:instrText>
+              <w:instrText xml:space="preserve"> PAGEREF _Toc242550812 \h </w:instrText>
             </w:r>
             <w:r>
               <w:rPr>
@@ -922,7 +922,7 @@
               <w:noProof/>
             </w:rPr>
           </w:pPr>
-          <w:hyperlink w:anchor="_Toc242548964" w:history="1">
+          <w:hyperlink w:anchor="_Toc242550813" w:history="1">
             <w:r>
               <w:rPr>
                 <w:rStyle w:val="Hipervnculo"/>
@@ -946,7 +946,7 @@
               <w:rPr>
                 <w:noProof/>
               </w:rPr>
-              <w:instrText xml:space="preserve"> PAGEREF _Toc242548964 \h </w:instrText>
+              <w:instrText xml:space="preserve"> PAGEREF _Toc242550813 \h </w:instrText>
             </w:r>
             <w:r>
               <w:rPr>
@@ -983,7 +983,7 @@
               <w:noProof/>
             </w:rPr>
           </w:pPr>
-          <w:hyperlink w:anchor="_Toc242548965" w:history="1">
+          <w:hyperlink w:anchor="_Toc242550814" w:history="1">
             <w:r>
               <w:rPr>
                 <w:rStyle w:val="Hipervnculo"/>
@@ -1007,7 +1007,7 @@
               <w:rPr>
                 <w:noProof/>
               </w:rPr>
-              <w:instrText xml:space="preserve"> PAGEREF _Toc242548965 \h </w:instrText>
+              <w:instrText xml:space="preserve"> PAGEREF _Toc242550814 \h </w:instrText>
             </w:r>
             <w:r>
               <w:rPr>
@@ -1044,7 +1044,7 @@
               <w:noProof/>
             </w:rPr>
           </w:pPr>
-          <w:hyperlink w:anchor="_Toc242548966" w:history="1">
+          <w:hyperlink w:anchor="_Toc242550815" w:history="1">
             <w:r>
               <w:rPr>
                 <w:rStyle w:val="Hipervnculo"/>
@@ -1068,7 +1068,7 @@
               <w:rPr>
                 <w:noProof/>
               </w:rPr>
-              <w:instrText xml:space="preserve"> PAGEREF _Toc242548966 \h </w:instrText>
+              <w:instrText xml:space="preserve"> PAGEREF _Toc242550815 \h </w:instrText>
             </w:r>
             <w:r>
               <w:rPr>
@@ -1105,7 +1105,7 @@
               <w:noProof/>
             </w:rPr>
           </w:pPr>
-          <w:hyperlink w:anchor="_Toc242548967" w:history="1">
+          <w:hyperlink w:anchor="_Toc242550816" w:history="1">
             <w:r>
               <w:rPr>
                 <w:rStyle w:val="Hipervnculo"/>
@@ -1129,7 +1129,7 @@
               <w:rPr>
                 <w:noProof/>
               </w:rPr>
-              <w:instrText xml:space="preserve"> PAGEREF _Toc242548967 \h </w:instrText>
+              <w:instrText xml:space="preserve"> PAGEREF _Toc242550816 \h </w:instrText>
             </w:r>
             <w:r>
               <w:rPr>
@@ -1166,7 +1166,7 @@
               <w:noProof/>
             </w:rPr>
           </w:pPr>
-          <w:hyperlink w:anchor="_Toc242548968" w:history="1">
+          <w:hyperlink w:anchor="_Toc242550817" w:history="1">
             <w:r>
               <w:rPr>
                 <w:rStyle w:val="Hipervnculo"/>
@@ -1190,7 +1190,7 @@
               <w:rPr>
                 <w:noProof/>
               </w:rPr>
-              <w:instrText xml:space="preserve"> PAGEREF _Toc242548968 \h </w:instrText>
+              <w:instrText xml:space="preserve"> PAGEREF _Toc242550817 \h </w:instrText>
             </w:r>
             <w:r>
               <w:rPr>
@@ -1227,7 +1227,7 @@
               <w:noProof/>
             </w:rPr>
           </w:pPr>
-          <w:hyperlink w:anchor="_Toc242548969" w:history="1">
+          <w:hyperlink w:anchor="_Toc242550818" w:history="1">
             <w:r>
               <w:rPr>
                 <w:rStyle w:val="Hipervnculo"/>
@@ -1251,7 +1251,7 @@
               <w:rPr>
                 <w:noProof/>
               </w:rPr>
-              <w:instrText xml:space="preserve"> PAGEREF _Toc242548969 \h </w:instrText>
+              <w:instrText xml:space="preserve"> PAGEREF _Toc242550818 \h </w:instrText>
             </w:r>
             <w:r>
               <w:rPr>
@@ -1288,7 +1288,7 @@
               <w:noProof/>
             </w:rPr>
           </w:pPr>
-          <w:hyperlink w:anchor="_Toc242548970" w:history="1">
+          <w:hyperlink w:anchor="_Toc242550819" w:history="1">
             <w:r>
               <w:rPr>
                 <w:rStyle w:val="Hipervnculo"/>
@@ -1312,7 +1312,7 @@
               <w:rPr>
                 <w:noProof/>
               </w:rPr>
-              <w:instrText xml:space="preserve"> PAGEREF _Toc242548970 \h </w:instrText>
+              <w:instrText xml:space="preserve"> PAGEREF _Toc242550819 \h </w:instrText>
             </w:r>
             <w:r>
               <w:rPr>
@@ -1349,7 +1349,7 @@
               <w:noProof/>
             </w:rPr>
           </w:pPr>
-          <w:hyperlink w:anchor="_Toc242548971" w:history="1">
+          <w:hyperlink w:anchor="_Toc242550820" w:history="1">
             <w:r>
               <w:rPr>
                 <w:rStyle w:val="Hipervnculo"/>
@@ -1373,7 +1373,7 @@
               <w:rPr>
                 <w:noProof/>
               </w:rPr>
-              <w:instrText xml:space="preserve"> PAGEREF _Toc242548971 \h </w:instrText>
+              <w:instrText xml:space="preserve"> PAGEREF _Toc242550820 \h </w:instrText>
             </w:r>
             <w:r>
               <w:rPr>
@@ -1410,7 +1410,7 @@
               <w:noProof/>
             </w:rPr>
           </w:pPr>
-          <w:hyperlink w:anchor="_Toc242548972" w:history="1">
+          <w:hyperlink w:anchor="_Toc242550821" w:history="1">
             <w:r>
               <w:rPr>
                 <w:rStyle w:val="Hipervnculo"/>
@@ -1434,7 +1434,7 @@
               <w:rPr>
                 <w:noProof/>
               </w:rPr>
-              <w:instrText xml:space="preserve"> PAGEREF _Toc242548972 \h </w:instrText>
+              <w:instrText xml:space="preserve"> PAGEREF _Toc242550821 \h </w:instrText>
             </w:r>
             <w:r>
               <w:rPr>
@@ -1471,7 +1471,7 @@
               <w:noProof/>
             </w:rPr>
           </w:pPr>
-          <w:hyperlink w:anchor="_Toc242548973" w:history="1">
+          <w:hyperlink w:anchor="_Toc242550822" w:history="1">
             <w:r>
               <w:rPr>
                 <w:rStyle w:val="Hipervnculo"/>
@@ -1495,7 +1495,7 @@
               <w:rPr>
                 <w:noProof/>
               </w:rPr>
-              <w:instrText xml:space="preserve"> PAGEREF _Toc242548973 \h </w:instrText>
+              <w:instrText xml:space="preserve"> PAGEREF _Toc242550822 \h </w:instrText>
             </w:r>
             <w:r>
               <w:rPr>
@@ -1532,7 +1532,7 @@
               <w:noProof/>
             </w:rPr>
           </w:pPr>
-          <w:hyperlink w:anchor="_Toc242548974" w:history="1">
+          <w:hyperlink w:anchor="_Toc242550823" w:history="1">
             <w:r>
               <w:rPr>
                 <w:rStyle w:val="Hipervnculo"/>
@@ -1556,7 +1556,7 @@
               <w:rPr>
                 <w:noProof/>
               </w:rPr>
-              <w:instrText xml:space="preserve"> PAGEREF _Toc242548974 \h </w:instrText>
+              <w:instrText xml:space="preserve"> PAGEREF _Toc242550823 \h </w:instrText>
             </w:r>
             <w:r>
               <w:rPr>
@@ -1593,7 +1593,7 @@
               <w:noProof/>
             </w:rPr>
           </w:pPr>
-          <w:hyperlink w:anchor="_Toc242548975" w:history="1">
+          <w:hyperlink w:anchor="_Toc242550824" w:history="1">
             <w:r>
               <w:rPr>
                 <w:rStyle w:val="Hipervnculo"/>
@@ -1617,7 +1617,7 @@
               <w:rPr>
                 <w:noProof/>
               </w:rPr>
-              <w:instrText xml:space="preserve"> PAGEREF _Toc242548975 \h </w:instrText>
+              <w:instrText xml:space="preserve"> PAGEREF _Toc242550824 \h </w:instrText>
             </w:r>
             <w:r>
               <w:rPr>
@@ -1654,7 +1654,7 @@
               <w:noProof/>
             </w:rPr>
           </w:pPr>
-          <w:hyperlink w:anchor="_Toc242548976" w:history="1">
+          <w:hyperlink w:anchor="_Toc242550825" w:history="1">
             <w:r>
               <w:rPr>
                 <w:rStyle w:val="Hipervnculo"/>
@@ -1678,7 +1678,7 @@
               <w:rPr>
                 <w:noProof/>
               </w:rPr>
-              <w:instrText xml:space="preserve"> PAGEREF _Toc242548976 \h </w:instrText>
+              <w:instrText xml:space="preserve"> PAGEREF _Toc242550825 \h </w:instrText>
             </w:r>
             <w:r>
               <w:rPr>
@@ -1715,7 +1715,7 @@
               <w:noProof/>
             </w:rPr>
           </w:pPr>
-          <w:hyperlink w:anchor="_Toc242548977" w:history="1">
+          <w:hyperlink w:anchor="_Toc242550826" w:history="1">
             <w:r>
               <w:rPr>
                 <w:rStyle w:val="Hipervnculo"/>
@@ -1739,7 +1739,7 @@
               <w:rPr>
                 <w:noProof/>
               </w:rPr>
-              <w:instrText xml:space="preserve"> PAGEREF _Toc242548977 \h </w:instrText>
+              <w:instrText xml:space="preserve"> PAGEREF _Toc242550826 \h </w:instrText>
             </w:r>
             <w:r>
               <w:rPr>
@@ -1776,7 +1776,7 @@
               <w:noProof/>
             </w:rPr>
           </w:pPr>
-          <w:hyperlink w:anchor="_Toc242548978" w:history="1">
+          <w:hyperlink w:anchor="_Toc242550827" w:history="1">
             <w:r>
               <w:rPr>
                 <w:rStyle w:val="Hipervnculo"/>
@@ -1800,7 +1800,7 @@
               <w:rPr>
                 <w:noProof/>
               </w:rPr>
-              <w:instrText xml:space="preserve"> PAGEREF _Toc242548978 \h </w:instrText>
+              <w:instrText xml:space="preserve"> PAGEREF _Toc242550827 \h </w:instrText>
             </w:r>
             <w:r>
               <w:rPr>
@@ -1837,7 +1837,7 @@
               <w:noProof/>
             </w:rPr>
           </w:pPr>
-          <w:hyperlink w:anchor="_Toc242548979" w:history="1">
+          <w:hyperlink w:anchor="_Toc242550828" w:history="1">
             <w:r>
               <w:rPr>
                 <w:rStyle w:val="Hipervnculo"/>
@@ -1861,7 +1861,7 @@
               <w:rPr>
                 <w:noProof/>
               </w:rPr>
-              <w:instrText xml:space="preserve"> PAGEREF _Toc242548979 \h </w:instrText>
+              <w:instrText xml:space="preserve"> PAGEREF _Toc242550828 \h </w:instrText>
             </w:r>
             <w:r>
               <w:rPr>
@@ -1898,7 +1898,7 @@
               <w:noProof/>
             </w:rPr>
           </w:pPr>
-          <w:hyperlink w:anchor="_Toc242548980" w:history="1">
+          <w:hyperlink w:anchor="_Toc242550829" w:history="1">
             <w:r>
               <w:rPr>
                 <w:rStyle w:val="Hipervnculo"/>
@@ -1922,7 +1922,7 @@
               <w:rPr>
                 <w:noProof/>
               </w:rPr>
-              <w:instrText xml:space="preserve"> PAGEREF _Toc242548980 \h </w:instrText>
+              <w:instrText xml:space="preserve"> PAGEREF _Toc242550829 \h </w:instrText>
             </w:r>
             <w:r>
               <w:rPr>
@@ -1959,7 +1959,7 @@
               <w:noProof/>
             </w:rPr>
           </w:pPr>
-          <w:hyperlink w:anchor="_Toc242548981" w:history="1">
+          <w:hyperlink w:anchor="_Toc242550830" w:history="1">
             <w:r>
               <w:rPr>
                 <w:rStyle w:val="Hipervnculo"/>
@@ -1983,7 +1983,7 @@
               <w:rPr>
                 <w:noProof/>
               </w:rPr>
-              <w:instrText xml:space="preserve"> PAGEREF _Toc242548981 \h </w:instrText>
+              <w:instrText xml:space="preserve"> PAGEREF _Toc242550830 \h </w:instrText>
             </w:r>
             <w:r>
               <w:rPr>
@@ -2020,7 +2020,7 @@
               <w:noProof/>
             </w:rPr>
           </w:pPr>
-          <w:hyperlink w:anchor="_Toc242548982" w:history="1">
+          <w:hyperlink w:anchor="_Toc242550831" w:history="1">
             <w:r>
               <w:rPr>
                 <w:rStyle w:val="Hipervnculo"/>
@@ -2044,7 +2044,7 @@
               <w:rPr>
                 <w:noProof/>
               </w:rPr>
-              <w:instrText xml:space="preserve"> PAGEREF _Toc242548982 \h </w:instrText>
+              <w:instrText xml:space="preserve"> PAGEREF _Toc242550831 \h </w:instrText>
             </w:r>
             <w:r>
               <w:rPr>
@@ -2081,7 +2081,7 @@
               <w:noProof/>
             </w:rPr>
           </w:pPr>
-          <w:hyperlink w:anchor="_Toc242548983" w:history="1">
+          <w:hyperlink w:anchor="_Toc242550832" w:history="1">
             <w:r>
               <w:rPr>
                 <w:rStyle w:val="Hipervnculo"/>
@@ -2105,7 +2105,7 @@
               <w:rPr>
                 <w:noProof/>
               </w:rPr>
-              <w:instrText xml:space="preserve"> PAGEREF _Toc242548983 \h </w:instrText>
+              <w:instrText xml:space="preserve"> PAGEREF _Toc242550832 \h </w:instrText>
             </w:r>
             <w:r>
               <w:rPr>
@@ -2142,7 +2142,7 @@
               <w:noProof/>
             </w:rPr>
           </w:pPr>
-          <w:hyperlink w:anchor="_Toc242548984" w:history="1">
+          <w:hyperlink w:anchor="_Toc242550833" w:history="1">
             <w:r>
               <w:rPr>
                 <w:rStyle w:val="Hipervnculo"/>
@@ -2166,7 +2166,7 @@
               <w:rPr>
                 <w:noProof/>
               </w:rPr>
-              <w:instrText xml:space="preserve"> PAGEREF _Toc242548984 \h </w:instrText>
+              <w:instrText xml:space="preserve"> PAGEREF _Toc242550833 \h </w:instrText>
             </w:r>
             <w:r>
               <w:rPr>
@@ -2203,7 +2203,7 @@
               <w:noProof/>
             </w:rPr>
           </w:pPr>
-          <w:hyperlink w:anchor="_Toc242548985" w:history="1">
+          <w:hyperlink w:anchor="_Toc242550834" w:history="1">
             <w:r>
               <w:rPr>
                 <w:rStyle w:val="Hipervnculo"/>
@@ -2227,7 +2227,7 @@
               <w:rPr>
                 <w:noProof/>
               </w:rPr>
-              <w:instrText xml:space="preserve"> PAGEREF _Toc242548985 \h </w:instrText>
+              <w:instrText xml:space="preserve"> PAGEREF _Toc242550834 \h </w:instrText>
             </w:r>
             <w:r>
               <w:rPr>
@@ -2264,7 +2264,7 @@
               <w:noProof/>
             </w:rPr>
           </w:pPr>
-          <w:hyperlink w:anchor="_Toc242548986" w:history="1">
+          <w:hyperlink w:anchor="_Toc242550835" w:history="1">
             <w:r>
               <w:rPr>
                 <w:rStyle w:val="Hipervnculo"/>
@@ -2288,7 +2288,7 @@
               <w:rPr>
                 <w:noProof/>
               </w:rPr>
-              <w:instrText xml:space="preserve"> PAGEREF _Toc242548986 \h </w:instrText>
+              <w:instrText xml:space="preserve"> PAGEREF _Toc242550835 \h </w:instrText>
             </w:r>
             <w:r>
               <w:rPr>
@@ -2325,7 +2325,7 @@
               <w:noProof/>
             </w:rPr>
           </w:pPr>
-          <w:hyperlink w:anchor="_Toc242548987" w:history="1">
+          <w:hyperlink w:anchor="_Toc242550836" w:history="1">
             <w:r>
               <w:rPr>
                 <w:rStyle w:val="Hipervnculo"/>
@@ -2349,7 +2349,7 @@
               <w:rPr>
                 <w:noProof/>
               </w:rPr>
-              <w:instrText xml:space="preserve"> PAGEREF _Toc242548987 \h </w:instrText>
+              <w:instrText xml:space="preserve"> PAGEREF _Toc242550836 \h </w:instrText>
             </w:r>
             <w:r>
               <w:rPr>
@@ -2386,7 +2386,7 @@
               <w:noProof/>
             </w:rPr>
           </w:pPr>
-          <w:hyperlink w:anchor="_Toc242548988" w:history="1">
+          <w:hyperlink w:anchor="_Toc242550837" w:history="1">
             <w:r>
               <w:rPr>
                 <w:rStyle w:val="Hipervnculo"/>
@@ -2410,7 +2410,7 @@
               <w:rPr>
                 <w:noProof/>
               </w:rPr>
-              <w:instrText xml:space="preserve"> PAGEREF _Toc242548988 \h </w:instrText>
+              <w:instrText xml:space="preserve"> PAGEREF _Toc242550837 \h </w:instrText>
             </w:r>
             <w:r>
               <w:rPr>
@@ -2447,7 +2447,7 @@
               <w:noProof/>
             </w:rPr>
           </w:pPr>
-          <w:hyperlink w:anchor="_Toc242548989" w:history="1">
+          <w:hyperlink w:anchor="_Toc242550838" w:history="1">
             <w:r>
               <w:rPr>
                 <w:rStyle w:val="Hipervnculo"/>
@@ -2471,7 +2471,7 @@
               <w:rPr>
                 <w:noProof/>
               </w:rPr>
-              <w:instrText xml:space="preserve"> PAGEREF _Toc242548989 \h </w:instrText>
+              <w:instrText xml:space="preserve"> PAGEREF _Toc242550838 \h </w:instrText>
             </w:r>
             <w:r>
               <w:rPr>
@@ -2508,7 +2508,7 @@
               <w:noProof/>
             </w:rPr>
           </w:pPr>
-          <w:hyperlink w:anchor="_Toc242548990" w:history="1">
+          <w:hyperlink w:anchor="_Toc242550839" w:history="1">
             <w:r>
               <w:rPr>
                 <w:rStyle w:val="Hipervnculo"/>
@@ -2532,7 +2532,7 @@
               <w:rPr>
                 <w:noProof/>
               </w:rPr>
-              <w:instrText xml:space="preserve"> PAGEREF _Toc242548990 \h </w:instrText>
+              <w:instrText xml:space="preserve"> PAGEREF _Toc242550839 \h </w:instrText>
             </w:r>
             <w:r>
               <w:rPr>
@@ -2569,7 +2569,7 @@
               <w:noProof/>
             </w:rPr>
           </w:pPr>
-          <w:hyperlink w:anchor="_Toc242548991" w:history="1">
+          <w:hyperlink w:anchor="_Toc242550840" w:history="1">
             <w:r>
               <w:rPr>
                 <w:rStyle w:val="Hipervnculo"/>
@@ -2593,7 +2593,7 @@
               <w:rPr>
                 <w:noProof/>
               </w:rPr>
-              <w:instrText xml:space="preserve"> PAGEREF _Toc242548991 \h </w:instrText>
+              <w:instrText xml:space="preserve"> PAGEREF _Toc242550840 \h </w:instrText>
             </w:r>
             <w:r>
               <w:rPr>
@@ -2630,7 +2630,7 @@
               <w:noProof/>
             </w:rPr>
           </w:pPr>
-          <w:hyperlink w:anchor="_Toc242548992" w:history="1">
+          <w:hyperlink w:anchor="_Toc242550841" w:history="1">
             <w:r>
               <w:rPr>
                 <w:rStyle w:val="Hipervnculo"/>
@@ -2654,7 +2654,7 @@
               <w:rPr>
                 <w:noProof/>
               </w:rPr>
-              <w:instrText xml:space="preserve"> PAGEREF _Toc242548992 \h </w:instrText>
+              <w:instrText xml:space="preserve"> PAGEREF _Toc242550841 \h </w:instrText>
             </w:r>
             <w:r>
               <w:rPr>
@@ -2691,7 +2691,7 @@
               <w:noProof/>
             </w:rPr>
           </w:pPr>
-          <w:hyperlink w:anchor="_Toc242548993" w:history="1">
+          <w:hyperlink w:anchor="_Toc242550842" w:history="1">
             <w:r>
               <w:rPr>
                 <w:rStyle w:val="Hipervnculo"/>
@@ -2715,7 +2715,7 @@
               <w:rPr>
                 <w:noProof/>
               </w:rPr>
-              <w:instrText xml:space="preserve"> PAGEREF _Toc242548993 \h </w:instrText>
+              <w:instrText xml:space="preserve"> PAGEREF _Toc242550842 \h </w:instrText>
             </w:r>
             <w:r>
               <w:rPr>
@@ -2752,7 +2752,7 @@
               <w:noProof/>
             </w:rPr>
           </w:pPr>
-          <w:hyperlink w:anchor="_Toc242548994" w:history="1">
+          <w:hyperlink w:anchor="_Toc242550843" w:history="1">
             <w:r>
               <w:rPr>
                 <w:rStyle w:val="Hipervnculo"/>
@@ -2776,7 +2776,7 @@
               <w:rPr>
                 <w:noProof/>
               </w:rPr>
-              <w:instrText xml:space="preserve"> PAGEREF _Toc242548994 \h </w:instrText>
+              <w:instrText xml:space="preserve"> PAGEREF _Toc242550843 \h </w:instrText>
             </w:r>
             <w:r>
               <w:rPr>
@@ -2813,7 +2813,7 @@
               <w:noProof/>
             </w:rPr>
           </w:pPr>
-          <w:hyperlink w:anchor="_Toc242548995" w:history="1">
+          <w:hyperlink w:anchor="_Toc242550844" w:history="1">
             <w:r>
               <w:rPr>
                 <w:rStyle w:val="Hipervnculo"/>
@@ -2837,7 +2837,7 @@
               <w:rPr>
                 <w:noProof/>
               </w:rPr>
-              <w:instrText xml:space="preserve"> PAGEREF _Toc242548995 \h </w:instrText>
+              <w:instrText xml:space="preserve"> PAGEREF _Toc242550844 \h </w:instrText>
             </w:r>
             <w:r>
               <w:rPr>
@@ -2874,7 +2874,7 @@
               <w:noProof/>
             </w:rPr>
           </w:pPr>
-          <w:hyperlink w:anchor="_Toc242548996" w:history="1">
+          <w:hyperlink w:anchor="_Toc242550845" w:history="1">
             <w:r>
               <w:rPr>
                 <w:rStyle w:val="Hipervnculo"/>
@@ -2898,7 +2898,7 @@
               <w:rPr>
                 <w:noProof/>
               </w:rPr>
-              <w:instrText xml:space="preserve"> PAGEREF _Toc242548996 \h </w:instrText>
+              <w:instrText xml:space="preserve"> PAGEREF _Toc242550845 \h </w:instrText>
             </w:r>
             <w:r>
               <w:rPr>
@@ -2935,7 +2935,7 @@
               <w:noProof/>
             </w:rPr>
           </w:pPr>
-          <w:hyperlink w:anchor="_Toc242548997" w:history="1">
+          <w:hyperlink w:anchor="_Toc242550846" w:history="1">
             <w:r>
               <w:rPr>
                 <w:rStyle w:val="Hipervnculo"/>
@@ -2959,7 +2959,7 @@
               <w:rPr>
                 <w:noProof/>
               </w:rPr>
-              <w:instrText xml:space="preserve"> PAGEREF _Toc242548997 \h </w:instrText>
+              <w:instrText xml:space="preserve"> PAGEREF _Toc242550846 \h </w:instrText>
             </w:r>
             <w:r>
               <w:rPr>
@@ -2996,7 +2996,7 @@
               <w:noProof/>
             </w:rPr>
           </w:pPr>
-          <w:hyperlink w:anchor="_Toc242548998" w:history="1">
+          <w:hyperlink w:anchor="_Toc242550847" w:history="1">
             <w:r>
               <w:rPr>
                 <w:rStyle w:val="Hipervnculo"/>
@@ -3020,7 +3020,7 @@
               <w:rPr>
                 <w:noProof/>
               </w:rPr>
-              <w:instrText xml:space="preserve"> PAGEREF _Toc242548998 \h </w:instrText>
+              <w:instrText xml:space="preserve"> PAGEREF _Toc242550847 \h </w:instrText>
             </w:r>
             <w:r>
               <w:rPr>
@@ -3037,7 +3037,7 @@
               <w:rPr>
                 <w:noProof/>
               </w:rPr>
-              <w:t>31</w:t>
+              <w:t>32</w:t>
             </w:r>
             <w:r>
               <w:rPr>
@@ -3057,7 +3057,7 @@
               <w:noProof/>
             </w:rPr>
           </w:pPr>
-          <w:hyperlink w:anchor="_Toc242548999" w:history="1">
+          <w:hyperlink w:anchor="_Toc242550848" w:history="1">
             <w:r>
               <w:rPr>
                 <w:rStyle w:val="Hipervnculo"/>
@@ -3081,7 +3081,7 @@
               <w:rPr>
                 <w:noProof/>
               </w:rPr>
-              <w:instrText xml:space="preserve"> PAGEREF _Toc242548999 \h </w:instrText>
+              <w:instrText xml:space="preserve"> PAGEREF _Toc242550848 \h </w:instrText>
             </w:r>
             <w:r>
               <w:rPr>
@@ -3098,7 +3098,7 @@
               <w:rPr>
                 <w:noProof/>
               </w:rPr>
-              <w:t>31</w:t>
+              <w:t>32</w:t>
             </w:r>
             <w:r>
               <w:rPr>
@@ -3118,7 +3118,7 @@
               <w:noProof/>
             </w:rPr>
           </w:pPr>
-          <w:hyperlink w:anchor="_Toc242549000" w:history="1">
+          <w:hyperlink w:anchor="_Toc242550849" w:history="1">
             <w:r>
               <w:rPr>
                 <w:rStyle w:val="Hipervnculo"/>
@@ -3142,7 +3142,7 @@
               <w:rPr>
                 <w:noProof/>
               </w:rPr>
-              <w:instrText xml:space="preserve"> PAGEREF _Toc242549000 \h </w:instrText>
+              <w:instrText xml:space="preserve"> PAGEREF _Toc242550849 \h </w:instrText>
             </w:r>
             <w:r>
               <w:rPr>
@@ -3159,7 +3159,7 @@
               <w:rPr>
                 <w:noProof/>
               </w:rPr>
-              <w:t>31</w:t>
+              <w:t>32</w:t>
             </w:r>
             <w:r>
               <w:rPr>
@@ -3179,7 +3179,7 @@
               <w:noProof/>
             </w:rPr>
           </w:pPr>
-          <w:hyperlink w:anchor="_Toc242549001" w:history="1">
+          <w:hyperlink w:anchor="_Toc242550850" w:history="1">
             <w:r>
               <w:rPr>
                 <w:rStyle w:val="Hipervnculo"/>
@@ -3203,7 +3203,7 @@
               <w:rPr>
                 <w:noProof/>
               </w:rPr>
-              <w:instrText xml:space="preserve"> PAGEREF _Toc242549001 \h </w:instrText>
+              <w:instrText xml:space="preserve"> PAGEREF _Toc242550850 \h </w:instrText>
             </w:r>
             <w:r>
               <w:rPr>
@@ -3220,7 +3220,7 @@
               <w:rPr>
                 <w:noProof/>
               </w:rPr>
-              <w:t>32</w:t>
+              <w:t>33</w:t>
             </w:r>
             <w:r>
               <w:rPr>
@@ -3240,7 +3240,7 @@
               <w:noProof/>
             </w:rPr>
           </w:pPr>
-          <w:hyperlink w:anchor="_Toc242549002" w:history="1">
+          <w:hyperlink w:anchor="_Toc242550851" w:history="1">
             <w:r>
               <w:rPr>
                 <w:rStyle w:val="Hipervnculo"/>
@@ -3264,7 +3264,7 @@
               <w:rPr>
                 <w:noProof/>
               </w:rPr>
-              <w:instrText xml:space="preserve"> PAGEREF _Toc242549002 \h </w:instrText>
+              <w:instrText xml:space="preserve"> PAGEREF _Toc242550851 \h </w:instrText>
             </w:r>
             <w:r>
               <w:rPr>
@@ -3281,7 +3281,7 @@
               <w:rPr>
                 <w:noProof/>
               </w:rPr>
-              <w:t>32</w:t>
+              <w:t>33</w:t>
             </w:r>
             <w:r>
               <w:rPr>
@@ -3301,7 +3301,7 @@
               <w:noProof/>
             </w:rPr>
           </w:pPr>
-          <w:hyperlink w:anchor="_Toc242549003" w:history="1">
+          <w:hyperlink w:anchor="_Toc242550852" w:history="1">
             <w:r>
               <w:rPr>
                 <w:rStyle w:val="Hipervnculo"/>
@@ -3325,7 +3325,7 @@
               <w:rPr>
                 <w:noProof/>
               </w:rPr>
-              <w:instrText xml:space="preserve"> PAGEREF _Toc242549003 \h </w:instrText>
+              <w:instrText xml:space="preserve"> PAGEREF _Toc242550852 \h </w:instrText>
             </w:r>
             <w:r>
               <w:rPr>
@@ -3342,7 +3342,7 @@
               <w:rPr>
                 <w:noProof/>
               </w:rPr>
-              <w:t>32</w:t>
+              <w:t>33</w:t>
             </w:r>
             <w:r>
               <w:rPr>
@@ -3362,7 +3362,7 @@
               <w:noProof/>
             </w:rPr>
           </w:pPr>
-          <w:hyperlink w:anchor="_Toc242549004" w:history="1">
+          <w:hyperlink w:anchor="_Toc242550853" w:history="1">
             <w:r>
               <w:rPr>
                 <w:rStyle w:val="Hipervnculo"/>
@@ -3386,7 +3386,7 @@
               <w:rPr>
                 <w:noProof/>
               </w:rPr>
-              <w:instrText xml:space="preserve"> PAGEREF _Toc242549004 \h </w:instrText>
+              <w:instrText xml:space="preserve"> PAGEREF _Toc242550853 \h </w:instrText>
             </w:r>
             <w:r>
               <w:rPr>
@@ -3403,7 +3403,7 @@
               <w:rPr>
                 <w:noProof/>
               </w:rPr>
-              <w:t>32</w:t>
+              <w:t>33</w:t>
             </w:r>
             <w:r>
               <w:rPr>
@@ -3423,7 +3423,7 @@
               <w:noProof/>
             </w:rPr>
           </w:pPr>
-          <w:hyperlink w:anchor="_Toc242549005" w:history="1">
+          <w:hyperlink w:anchor="_Toc242550854" w:history="1">
             <w:r>
               <w:rPr>
                 <w:rStyle w:val="Hipervnculo"/>
@@ -3447,7 +3447,7 @@
               <w:rPr>
                 <w:noProof/>
               </w:rPr>
-              <w:instrText xml:space="preserve"> PAGEREF _Toc242549005 \h </w:instrText>
+              <w:instrText xml:space="preserve"> PAGEREF _Toc242550854 \h </w:instrText>
             </w:r>
             <w:r>
               <w:rPr>
@@ -3464,7 +3464,7 @@
               <w:rPr>
                 <w:noProof/>
               </w:rPr>
-              <w:t>33</w:t>
+              <w:t>34</w:t>
             </w:r>
             <w:r>
               <w:rPr>
@@ -3484,7 +3484,7 @@
               <w:noProof/>
             </w:rPr>
           </w:pPr>
-          <w:hyperlink w:anchor="_Toc242549006" w:history="1">
+          <w:hyperlink w:anchor="_Toc242550855" w:history="1">
             <w:r>
               <w:rPr>
                 <w:rStyle w:val="Hipervnculo"/>
@@ -3508,7 +3508,7 @@
               <w:rPr>
                 <w:noProof/>
               </w:rPr>
-              <w:instrText xml:space="preserve"> PAGEREF _Toc242549006 \h </w:instrText>
+              <w:instrText xml:space="preserve"> PAGEREF _Toc242550855 \h </w:instrText>
             </w:r>
             <w:r>
               <w:rPr>
@@ -3525,7 +3525,7 @@
               <w:rPr>
                 <w:noProof/>
               </w:rPr>
-              <w:t>34</w:t>
+              <w:t>35</w:t>
             </w:r>
             <w:r>
               <w:rPr>
@@ -3546,7 +3546,7 @@
       <w:pPr>
         <w:pStyle w:val="Ttulo1"/>
       </w:pPr>
-      <w:bookmarkStart w:id="1" w:name="_Toc242548959"/>
+      <w:bookmarkStart w:id="1" w:name="_Toc242550808"/>
       <w:r>
         <w:t>1. Proceso seleccionado</w:t>
       </w:r>
@@ -3556,7 +3556,7 @@
       <w:pPr>
         <w:pStyle w:val="Ttulo2"/>
       </w:pPr>
-      <w:bookmarkStart w:id="2" w:name="_Toc242548960"/>
+      <w:bookmarkStart w:id="2" w:name="_Toc242550809"/>
       <w:r>
         <w:t>Proceso actual</w:t>
       </w:r>
@@ -3594,7 +3594,7 @@
       <w:pPr>
         <w:pStyle w:val="Ttulo2"/>
       </w:pPr>
-      <w:bookmarkStart w:id="3" w:name="_Toc242548961"/>
+      <w:bookmarkStart w:id="3" w:name="_Toc242550810"/>
       <w:r>
         <w:t>Problema identificado</w:t>
       </w:r>
@@ -3669,7 +3669,7 @@
       <w:pPr>
         <w:pStyle w:val="Ttulo2"/>
       </w:pPr>
-      <w:bookmarkStart w:id="4" w:name="_Toc242548962"/>
+      <w:bookmarkStart w:id="4" w:name="_Toc242550811"/>
       <w:r>
         <w:t>Justificación de la automatización</w:t>
       </w:r>
@@ -3701,7 +3701,7 @@
         <w:pStyle w:val="Ttulo1"/>
         <w:pageBreakBefore/>
       </w:pPr>
-      <w:bookmarkStart w:id="5" w:name="_Toc242548963"/>
+      <w:bookmarkStart w:id="5" w:name="_Toc242550812"/>
       <w:r>
         <w:t>2. Solución desarrollada</w:t>
       </w:r>
@@ -3711,7 +3711,7 @@
       <w:pPr>
         <w:pStyle w:val="Ttulo2"/>
       </w:pPr>
-      <w:bookmarkStart w:id="6" w:name="_Toc242548964"/>
+      <w:bookmarkStart w:id="6" w:name="_Toc242550813"/>
       <w:r>
         <w:t>Descripción</w:t>
       </w:r>
@@ -3781,7 +3781,7 @@
       <w:pPr>
         <w:pStyle w:val="Ttulo2"/>
       </w:pPr>
-      <w:bookmarkStart w:id="7" w:name="_Toc242548965"/>
+      <w:bookmarkStart w:id="7" w:name="_Toc242550814"/>
       <w:r>
         <w:t>Pantallas por rol</w:t>
       </w:r>
@@ -4227,7 +4227,7 @@
       <w:pPr>
         <w:pStyle w:val="Ttulo2"/>
       </w:pPr>
-      <w:bookmarkStart w:id="8" w:name="_Toc242548966"/>
+      <w:bookmarkStart w:id="8" w:name="_Toc242550815"/>
       <w:r>
         <w:t>Funcionalidades principales</w:t>
       </w:r>
@@ -5536,7 +5536,7 @@
       <w:pPr>
         <w:pStyle w:val="Ttulo2"/>
       </w:pPr>
-      <w:bookmarkStart w:id="9" w:name="_Toc242548967"/>
+      <w:bookmarkStart w:id="9" w:name="_Toc242550816"/>
       <w:r>
         <w:t>Tecnologías</w:t>
       </w:r>
@@ -6152,7 +6152,7 @@
       <w:pPr>
         <w:pStyle w:val="Ttulo2"/>
       </w:pPr>
-      <w:bookmarkStart w:id="10" w:name="_Toc242548968"/>
+      <w:bookmarkStart w:id="10" w:name="_Toc242550817"/>
       <w:r>
         <w:t>Arquitectura</w:t>
       </w:r>
@@ -6169,7 +6169,7 @@
           <w:noProof/>
         </w:rPr>
         <w:drawing>
-          <wp:inline distT="0" distB="0" distL="0" distR="0" wp14:anchorId="518B059D" wp14:editId="5D632EE0">
+          <wp:inline distT="0" distB="0" distL="0" distR="0" wp14:anchorId="1F428F74" wp14:editId="57862A8F">
             <wp:extent cx="5905500" cy="2857500"/>
             <wp:effectExtent l="0" t="0" r="0" b="0"/>
             <wp:docPr id="1" name="Arquitectura de la solución" descr="Arquitectura de la solución" title="Arquitectura de la solución"/>
@@ -6238,7 +6238,7 @@
       <w:pPr>
         <w:pStyle w:val="Ttulo2"/>
       </w:pPr>
-      <w:bookmarkStart w:id="11" w:name="_Toc242548969"/>
+      <w:bookmarkStart w:id="11" w:name="_Toc242550818"/>
       <w:r>
         <w:t>Flujo principal (cobro en campo)</w:t>
       </w:r>
@@ -6255,7 +6255,7 @@
           <w:noProof/>
         </w:rPr>
         <w:drawing>
-          <wp:inline distT="0" distB="0" distL="0" distR="0" wp14:anchorId="410A3538" wp14:editId="3FA88A1F">
+          <wp:inline distT="0" distB="0" distL="0" distR="0" wp14:anchorId="511B8C7C" wp14:editId="28E95767">
             <wp:extent cx="5905500" cy="4057650"/>
             <wp:effectExtent l="0" t="0" r="0" b="0"/>
             <wp:docPr id="2" name="Flujo principal del cobro en campo (diagrama de secuencia)" descr="Flujo principal del cobro en campo (diagrama de secuencia)" title="Flujo principal del cobro en campo (diagrama de secuencia)"/>
@@ -6325,7 +6325,7 @@
         <w:pStyle w:val="Ttulo1"/>
         <w:pageBreakBefore/>
       </w:pPr>
-      <w:bookmarkStart w:id="12" w:name="_Toc242548970"/>
+      <w:bookmarkStart w:id="12" w:name="_Toc242550819"/>
       <w:r>
         <w:t>3. Código fuente</w:t>
       </w:r>
@@ -6565,7 +6565,7 @@
       <w:pPr>
         <w:pStyle w:val="Ttulo2"/>
       </w:pPr>
-      <w:bookmarkStart w:id="13" w:name="_Toc242548971"/>
+      <w:bookmarkStart w:id="13" w:name="_Toc242550820"/>
       <w:r>
         <w:t>Componentes principales</w:t>
       </w:r>
@@ -6914,7 +6914,7 @@
         <w:pStyle w:val="Ttulo1"/>
         <w:pageBreakBefore/>
       </w:pPr>
-      <w:bookmarkStart w:id="14" w:name="_Toc242548972"/>
+      <w:bookmarkStart w:id="14" w:name="_Toc242550821"/>
       <w:r>
         <w:t>4. Puesta en producción</w:t>
       </w:r>
@@ -6924,7 +6924,7 @@
       <w:pPr>
         <w:pStyle w:val="Ttulo2"/>
       </w:pPr>
-      <w:bookmarkStart w:id="15" w:name="_Toc242548973"/>
+      <w:bookmarkStart w:id="15" w:name="_Toc242550822"/>
       <w:r>
         <w:t>Entorno utilizado</w:t>
       </w:r>
@@ -7469,7 +7469,7 @@
       <w:pPr>
         <w:pStyle w:val="Ttulo2"/>
       </w:pPr>
-      <w:bookmarkStart w:id="16" w:name="_Toc242548974"/>
+      <w:bookmarkStart w:id="16" w:name="_Toc242550823"/>
       <w:r>
         <w:t>Proceso de despliegue (CI/CD)</w:t>
       </w:r>
@@ -7486,7 +7486,7 @@
           <w:noProof/>
         </w:rPr>
         <w:drawing>
-          <wp:inline distT="0" distB="0" distL="0" distR="0" wp14:anchorId="3FC7ACDD" wp14:editId="6A3F7FD0">
+          <wp:inline distT="0" distB="0" distL="0" distR="0" wp14:anchorId="1ACAC28B" wp14:editId="6F9603D8">
             <wp:extent cx="5905500" cy="1123950"/>
             <wp:effectExtent l="0" t="0" r="0" b="0"/>
             <wp:docPr id="3" name="Proceso de despliegue CI/CD" descr="Proceso de despliegue CI/CD" title="Proceso de despliegue CI/CD"/>
@@ -7684,7 +7684,7 @@
       <w:pPr>
         <w:pStyle w:val="Ttulo2"/>
       </w:pPr>
-      <w:bookmarkStart w:id="17" w:name="_Toc242548975"/>
+      <w:bookmarkStart w:id="17" w:name="_Toc242550824"/>
       <w:r>
         <w:t>Evidencias de funcionamiento</w:t>
       </w:r>
@@ -7701,7 +7701,7 @@
           <w:noProof/>
         </w:rPr>
         <w:drawing>
-          <wp:inline distT="0" distB="0" distL="0" distR="0" wp14:anchorId="21172D20" wp14:editId="112AE0F2">
+          <wp:inline distT="0" distB="0" distL="0" distR="0" wp14:anchorId="691E5BE5" wp14:editId="4CB845B8">
             <wp:extent cx="5905500" cy="447675"/>
             <wp:effectExtent l="0" t="0" r="0" b="0"/>
             <wp:docPr id="4" name="/health ms_auth" descr="/health ms_auth" title="/health ms_auth"/>
@@ -7777,7 +7777,7 @@
           <w:noProof/>
         </w:rPr>
         <w:drawing>
-          <wp:inline distT="0" distB="0" distL="0" distR="0" wp14:anchorId="35045FDC" wp14:editId="03DE3A64">
+          <wp:inline distT="0" distB="0" distL="0" distR="0" wp14:anchorId="54578267" wp14:editId="3C328C19">
             <wp:extent cx="5905500" cy="447675"/>
             <wp:effectExtent l="0" t="0" r="0" b="0"/>
             <wp:docPr id="5" name="/health ms_pagos" descr="/health ms_pagos" title="/health ms_pagos"/>
@@ -7909,7 +7909,7 @@
           <w:noProof/>
         </w:rPr>
         <w:drawing>
-          <wp:inline distT="0" distB="0" distL="0" distR="0" wp14:anchorId="7F72BC08" wp14:editId="6FA47777">
+          <wp:inline distT="0" distB="0" distL="0" distR="0" wp14:anchorId="7A357D62" wp14:editId="711824CA">
             <wp:extent cx="5905500" cy="3495675"/>
             <wp:effectExtent l="0" t="0" r="0" b="0"/>
             <wp:docPr id="6" name="OpenAPI de ms_pagos" descr="OpenAPI de ms_pagos" title="OpenAPI de ms_pagos"/>
@@ -8023,7 +8023,7 @@
         <w:pStyle w:val="Ttulo1"/>
         <w:pageBreakBefore/>
       </w:pPr>
-      <w:bookmarkStart w:id="18" w:name="_Toc242548976"/>
+      <w:bookmarkStart w:id="18" w:name="_Toc242550825"/>
       <w:r>
         <w:t>5. Pruebas</w:t>
       </w:r>
@@ -8061,7 +8061,7 @@
       <w:pPr>
         <w:pStyle w:val="Ttulo2"/>
       </w:pPr>
-      <w:bookmarkStart w:id="19" w:name="_Toc242548977"/>
+      <w:bookmarkStart w:id="19" w:name="_Toc242550826"/>
       <w:r>
         <w:t>Resultados de la ejecución del 10/10/2026</w:t>
       </w:r>
@@ -9073,7 +9073,7 @@
       <w:pPr>
         <w:pStyle w:val="Ttulo2"/>
       </w:pPr>
-      <w:bookmarkStart w:id="20" w:name="_Toc242548978"/>
+      <w:bookmarkStart w:id="20" w:name="_Toc242550827"/>
       <w:r>
         <w:t>Pruebas funcionales de la aplicación web</w:t>
       </w:r>
@@ -10899,7 +10899,7 @@
         <w:pStyle w:val="Ttulo1"/>
         <w:pageBreakBefore/>
       </w:pPr>
-      <w:bookmarkStart w:id="21" w:name="_Toc242548979"/>
+      <w:bookmarkStart w:id="21" w:name="_Toc242550828"/>
       <w:r>
         <w:t>6. Manual de usuario</w:t>
       </w:r>
@@ -10909,7 +10909,7 @@
       <w:pPr>
         <w:pStyle w:val="Ttulo2"/>
       </w:pPr>
-      <w:bookmarkStart w:id="22" w:name="_Toc242548980"/>
+      <w:bookmarkStart w:id="22" w:name="_Toc242550829"/>
       <w:r>
         <w:t>Requisitos para acceder</w:t>
       </w:r>
@@ -11007,7 +11007,7 @@
       <w:pPr>
         <w:pStyle w:val="Ttulo2"/>
       </w:pPr>
-      <w:bookmarkStart w:id="23" w:name="_Toc242548981"/>
+      <w:bookmarkStart w:id="23" w:name="_Toc242550830"/>
       <w:r>
         <w:t>Iniciar sesión</w:t>
       </w:r>
@@ -11042,7 +11042,7 @@
           <w:noProof/>
         </w:rPr>
         <w:drawing>
-          <wp:inline distT="0" distB="0" distL="0" distR="0" wp14:anchorId="1387F41D" wp14:editId="61ACB4F4">
+          <wp:inline distT="0" distB="0" distL="0" distR="0" wp14:anchorId="464853E4" wp14:editId="5FC72B11">
             <wp:extent cx="5905500" cy="3495675"/>
             <wp:effectExtent l="0" t="0" r="0" b="0"/>
             <wp:docPr id="7" name="Inicio de sesión" descr="Inicio de sesión" title="Inicio de sesión"/>
@@ -11146,7 +11146,7 @@
           <w:noProof/>
         </w:rPr>
         <w:drawing>
-          <wp:inline distT="0" distB="0" distL="0" distR="0" wp14:anchorId="39A6EC3A" wp14:editId="53C14303">
+          <wp:inline distT="0" distB="0" distL="0" distR="0" wp14:anchorId="76CC11D3" wp14:editId="0DD4C603">
             <wp:extent cx="5905500" cy="3495675"/>
             <wp:effectExtent l="0" t="0" r="0" b="0"/>
             <wp:docPr id="8" name="Credenciales inválidas" descr="Credenciales inválidas" title="Credenciales inválidas"/>
@@ -11240,7 +11240,7 @@
           <w:noProof/>
         </w:rPr>
         <w:drawing>
-          <wp:inline distT="0" distB="0" distL="0" distR="0" wp14:anchorId="3834B10B" wp14:editId="5878BC80">
+          <wp:inline distT="0" distB="0" distL="0" distR="0" wp14:anchorId="36BD2C65" wp14:editId="125CE73A">
             <wp:extent cx="5905500" cy="3495675"/>
             <wp:effectExtent l="0" t="0" r="0" b="0"/>
             <wp:docPr id="9" name="Panel del técnico" descr="Panel del técnico" title="Panel del técnico"/>
@@ -11309,7 +11309,7 @@
       <w:pPr>
         <w:pStyle w:val="Ttulo2"/>
       </w:pPr>
-      <w:bookmarkStart w:id="24" w:name="_Toc242548982"/>
+      <w:bookmarkStart w:id="24" w:name="_Toc242550831"/>
       <w:r>
         <w:t>Técnico: cobro en campo</w:t>
       </w:r>
@@ -11470,7 +11470,7 @@
           <w:noProof/>
         </w:rPr>
         <w:drawing>
-          <wp:inline distT="0" distB="0" distL="0" distR="0" wp14:anchorId="2AE45B9C" wp14:editId="159B32BC">
+          <wp:inline distT="0" distB="0" distL="0" distR="0" wp14:anchorId="111F48F5" wp14:editId="783E8AE9">
             <wp:extent cx="5905500" cy="3495675"/>
             <wp:effectExtent l="0" t="0" r="0" b="0"/>
             <wp:docPr id="10" name="Facturas pendientes" descr="Facturas pendientes" title="Facturas pendientes"/>
@@ -11578,7 +11578,7 @@
           <w:noProof/>
         </w:rPr>
         <w:drawing>
-          <wp:inline distT="0" distB="0" distL="0" distR="0" wp14:anchorId="7DF61F93" wp14:editId="66263CF7">
+          <wp:inline distT="0" distB="0" distL="0" distR="0" wp14:anchorId="1263F76C" wp14:editId="20179791">
             <wp:extent cx="5905500" cy="3495675"/>
             <wp:effectExtent l="0" t="0" r="0" b="0"/>
             <wp:docPr id="11" name="Cobro rechazado" descr="Cobro rechazado" title="Cobro rechazado"/>
@@ -11705,7 +11705,7 @@
           <w:noProof/>
         </w:rPr>
         <w:drawing>
-          <wp:inline distT="0" distB="0" distL="0" distR="0" wp14:anchorId="63FDC597" wp14:editId="19922758">
+          <wp:inline distT="0" distB="0" distL="0" distR="0" wp14:anchorId="441E6B65" wp14:editId="5E0AD3BD">
             <wp:extent cx="5905500" cy="3495675"/>
             <wp:effectExtent l="0" t="0" r="0" b="0"/>
             <wp:docPr id="12" name="Cobro exitoso" descr="Cobro exitoso" title="Cobro exitoso"/>
@@ -11832,7 +11832,7 @@
           <w:noProof/>
         </w:rPr>
         <w:drawing>
-          <wp:inline distT="0" distB="0" distL="0" distR="0" wp14:anchorId="16FC2D9E" wp14:editId="636EC749">
+          <wp:inline distT="0" distB="0" distL="0" distR="0" wp14:anchorId="6069CF87" wp14:editId="564B4E06">
             <wp:extent cx="5905500" cy="3495675"/>
             <wp:effectExtent l="0" t="0" r="0" b="0"/>
             <wp:docPr id="13" name="Reactivación del servicio" descr="Reactivación del servicio" title="Reactivación del servicio"/>
@@ -11901,7 +11901,7 @@
       <w:pPr>
         <w:pStyle w:val="Ttulo2"/>
       </w:pPr>
-      <w:bookmarkStart w:id="25" w:name="_Toc242548983"/>
+      <w:bookmarkStart w:id="25" w:name="_Toc242550832"/>
       <w:r>
         <w:t>Técnico: tickets y red</w:t>
       </w:r>
@@ -12018,7 +12018,7 @@
           <w:noProof/>
         </w:rPr>
         <w:drawing>
-          <wp:inline distT="0" distB="0" distL="0" distR="0" wp14:anchorId="2BE020E6" wp14:editId="505AE82D">
+          <wp:inline distT="0" distB="0" distL="0" distR="0" wp14:anchorId="21FD302C" wp14:editId="092DC25B">
             <wp:extent cx="5905500" cy="3495675"/>
             <wp:effectExtent l="0" t="0" r="0" b="0"/>
             <wp:docPr id="14" name="Tickets del técnico" descr="Tickets del técnico" title="Tickets del técnico"/>
@@ -12094,7 +12094,7 @@
           <w:noProof/>
         </w:rPr>
         <w:drawing>
-          <wp:inline distT="0" distB="0" distL="0" distR="0" wp14:anchorId="4A89F145" wp14:editId="28F9C5A0">
+          <wp:inline distT="0" distB="0" distL="0" distR="0" wp14:anchorId="3B85E3A4" wp14:editId="1A7AE877">
             <wp:extent cx="5905500" cy="3495675"/>
             <wp:effectExtent l="0" t="0" r="0" b="0"/>
             <wp:docPr id="15" name="Red y equipos" descr="Red y equipos" title="Red y equipos"/>
@@ -12163,7 +12163,7 @@
       <w:pPr>
         <w:pStyle w:val="Ttulo2"/>
       </w:pPr>
-      <w:bookmarkStart w:id="26" w:name="_Toc242548984"/>
+      <w:bookmarkStart w:id="26" w:name="_Toc242550833"/>
       <w:r>
         <w:t>Secretaría: atención de oficina</w:t>
       </w:r>
@@ -12270,7 +12270,7 @@
           <w:noProof/>
         </w:rPr>
         <w:drawing>
-          <wp:inline distT="0" distB="0" distL="0" distR="0" wp14:anchorId="111F51A3" wp14:editId="798B8AC4">
+          <wp:inline distT="0" distB="0" distL="0" distR="0" wp14:anchorId="7834E78E" wp14:editId="20A439FC">
             <wp:extent cx="5905500" cy="3495675"/>
             <wp:effectExtent l="0" t="0" r="0" b="0"/>
             <wp:docPr id="16" name="Facturación" descr="Facturación" title="Facturación"/>
@@ -12339,7 +12339,7 @@
       <w:pPr>
         <w:pStyle w:val="Ttulo2"/>
       </w:pPr>
-      <w:bookmarkStart w:id="27" w:name="_Toc242548985"/>
+      <w:bookmarkStart w:id="27" w:name="_Toc242550834"/>
       <w:r>
         <w:t>Administrador</w:t>
       </w:r>
@@ -12435,7 +12435,7 @@
           <w:noProof/>
         </w:rPr>
         <w:drawing>
-          <wp:inline distT="0" distB="0" distL="0" distR="0" wp14:anchorId="79577603" wp14:editId="2B575830">
+          <wp:inline distT="0" distB="0" distL="0" distR="0" wp14:anchorId="575134B7" wp14:editId="616024D9">
             <wp:extent cx="5905500" cy="3495675"/>
             <wp:effectExtent l="0" t="0" r="0" b="0"/>
             <wp:docPr id="17" name="Ficha del cliente" descr="Ficha del cliente" title="Ficha del cliente"/>
@@ -12504,7 +12504,7 @@
       <w:pPr>
         <w:pStyle w:val="Ttulo2"/>
       </w:pPr>
-      <w:bookmarkStart w:id="28" w:name="_Toc242548986"/>
+      <w:bookmarkStart w:id="28" w:name="_Toc242550835"/>
       <w:r>
         <w:t>Jefatura: supervisión</w:t>
       </w:r>
@@ -12559,7 +12559,7 @@
           <w:noProof/>
         </w:rPr>
         <w:drawing>
-          <wp:inline distT="0" distB="0" distL="0" distR="0" wp14:anchorId="50DEF018" wp14:editId="13ADAD93">
+          <wp:inline distT="0" distB="0" distL="0" distR="0" wp14:anchorId="407286E7" wp14:editId="04AE1F3E">
             <wp:extent cx="5905500" cy="3495675"/>
             <wp:effectExtent l="0" t="0" r="0" b="0"/>
             <wp:docPr id="18" name="Panel de jefatura" descr="Panel de jefatura" title="Panel de jefatura"/>
@@ -12635,7 +12635,7 @@
           <w:noProof/>
         </w:rPr>
         <w:drawing>
-          <wp:inline distT="0" distB="0" distL="0" distR="0" wp14:anchorId="08E8A69D" wp14:editId="604C9014">
+          <wp:inline distT="0" distB="0" distL="0" distR="0" wp14:anchorId="26F14067" wp14:editId="10406FB6">
             <wp:extent cx="5905500" cy="3495675"/>
             <wp:effectExtent l="0" t="0" r="0" b="0"/>
             <wp:docPr id="19" name="Cierre diario" descr="Cierre diario" title="Cierre diario"/>
@@ -12704,7 +12704,7 @@
       <w:pPr>
         <w:pStyle w:val="Ttulo2"/>
       </w:pPr>
-      <w:bookmarkStart w:id="29" w:name="_Toc242548987"/>
+      <w:bookmarkStart w:id="29" w:name="_Toc242550836"/>
       <w:r>
         <w:t>Cliente</w:t>
       </w:r>
@@ -12759,7 +12759,7 @@
           <w:noProof/>
         </w:rPr>
         <w:drawing>
-          <wp:inline distT="0" distB="0" distL="0" distR="0" wp14:anchorId="74402E32" wp14:editId="5D3939AF">
+          <wp:inline distT="0" distB="0" distL="0" distR="0" wp14:anchorId="130A46C0" wp14:editId="0C48FEFB">
             <wp:extent cx="4762500" cy="6753225"/>
             <wp:effectExtent l="0" t="0" r="0" b="0"/>
             <wp:docPr id="20" name="Cliente en celular" descr="Cliente en celular" title="Cliente en celular"/>
@@ -12828,7 +12828,7 @@
       <w:pPr>
         <w:pStyle w:val="Ttulo2"/>
       </w:pPr>
-      <w:bookmarkStart w:id="30" w:name="_Toc242548988"/>
+      <w:bookmarkStart w:id="30" w:name="_Toc242550837"/>
       <w:r>
         <w:t>Cambiar la contraseña y cerrar sesión</w:t>
       </w:r>
@@ -12873,7 +12873,7 @@
           <w:noProof/>
         </w:rPr>
         <w:drawing>
-          <wp:inline distT="0" distB="0" distL="0" distR="0" wp14:anchorId="7766E2C9" wp14:editId="41172EA8">
+          <wp:inline distT="0" distB="0" distL="0" distR="0" wp14:anchorId="676AA4BE" wp14:editId="013F0AC2">
             <wp:extent cx="5905500" cy="3495675"/>
             <wp:effectExtent l="0" t="0" r="0" b="0"/>
             <wp:docPr id="21" name="Cambio de contraseña" descr="Cambio de contraseña" title="Cambio de contraseña"/>
@@ -12942,7 +12942,7 @@
       <w:pPr>
         <w:pStyle w:val="Ttulo2"/>
       </w:pPr>
-      <w:bookmarkStart w:id="31" w:name="_Toc242548989"/>
+      <w:bookmarkStart w:id="31" w:name="_Toc242550838"/>
       <w:r>
         <w:t>Buenas prácticas de uso seguro</w:t>
       </w:r>
@@ -13005,7 +13005,7 @@
         <w:pStyle w:val="Ttulo1"/>
         <w:pageBreakBefore/>
       </w:pPr>
-      <w:bookmarkStart w:id="32" w:name="_Toc242548990"/>
+      <w:bookmarkStart w:id="32" w:name="_Toc242550839"/>
       <w:r>
         <w:t>7. Seguridad de la solución</w:t>
       </w:r>
@@ -13023,7 +13023,7 @@
       <w:pPr>
         <w:pStyle w:val="Ttulo2"/>
       </w:pPr>
-      <w:bookmarkStart w:id="33" w:name="_Toc242548991"/>
+      <w:bookmarkStart w:id="33" w:name="_Toc242550840"/>
       <w:r>
         <w:t>7.1 Requerimientos de seguridad</w:t>
       </w:r>
@@ -13957,7 +13957,7 @@
       <w:pPr>
         <w:pStyle w:val="Ttulo2"/>
       </w:pPr>
-      <w:bookmarkStart w:id="34" w:name="_Toc242548992"/>
+      <w:bookmarkStart w:id="34" w:name="_Toc242550841"/>
       <w:r>
         <w:t>7.2 Arquitectura y UML: roles, permisos, límites de confianza y flujos críticos</w:t>
       </w:r>
@@ -16289,7 +16289,7 @@
           <w:noProof/>
         </w:rPr>
         <w:drawing>
-          <wp:inline distT="0" distB="0" distL="0" distR="0" wp14:anchorId="3165C3C4" wp14:editId="2813FCCA">
+          <wp:inline distT="0" distB="0" distL="0" distR="0" wp14:anchorId="6A8C6002" wp14:editId="264C1B06">
             <wp:extent cx="2085975" cy="5334000"/>
             <wp:effectExtent l="0" t="0" r="0" b="0"/>
             <wp:docPr id="22" name="Diagrama de casos de uso por rol" descr="Diagrama de casos de uso por rol" title="Diagrama de casos de uso por rol"/>
@@ -16378,7 +16378,7 @@
           <w:noProof/>
         </w:rPr>
         <w:drawing>
-          <wp:inline distT="0" distB="0" distL="0" distR="0" wp14:anchorId="21D588E8" wp14:editId="17F1F69D">
+          <wp:inline distT="0" distB="0" distL="0" distR="0" wp14:anchorId="50B58281" wp14:editId="5E5C7A16">
             <wp:extent cx="5905500" cy="2876550"/>
             <wp:effectExtent l="0" t="0" r="0" b="0"/>
             <wp:docPr id="23" name="Límites de confianza" descr="Límites de confianza" title="Límites de confianza"/>
@@ -16522,7 +16522,7 @@
       <w:pPr>
         <w:pStyle w:val="Ttulo2"/>
       </w:pPr>
-      <w:bookmarkStart w:id="35" w:name="_Toc242548993"/>
+      <w:bookmarkStart w:id="35" w:name="_Toc242550842"/>
       <w:r>
         <w:t>7.3 Datos y base de datos</w:t>
       </w:r>
@@ -17603,7 +17603,7 @@
                 <w:sz w:val="18"/>
                 <w:szCs w:val="18"/>
               </w:rPr>
-              <w:t>Hallazgo H4</w:t>
+              <w:t>Hallazgo H7</w:t>
             </w:r>
           </w:p>
         </w:tc>
@@ -17618,7 +17618,7 @@
       <w:pPr>
         <w:pStyle w:val="Ttulo2"/>
       </w:pPr>
-      <w:bookmarkStart w:id="36" w:name="_Toc242548994"/>
+      <w:bookmarkStart w:id="36" w:name="_Toc242550843"/>
       <w:r>
         <w:t>7.4 DevOps: accesos, repositorio, secretos, dependencias y CI/CD</w:t>
       </w:r>
@@ -18692,7 +18692,7 @@
       <w:pPr>
         <w:pStyle w:val="Ttulo2"/>
       </w:pPr>
-      <w:bookmarkStart w:id="37" w:name="_Toc242548995"/>
+      <w:bookmarkStart w:id="37" w:name="_Toc242550844"/>
       <w:r>
         <w:t>7.5 Aplicación: entradas, sesiones, permisos, errores y registros</w:t>
       </w:r>
@@ -19793,7 +19793,7 @@
       <w:pPr>
         <w:pStyle w:val="Ttulo2"/>
       </w:pPr>
-      <w:bookmarkStart w:id="38" w:name="_Toc242548996"/>
+      <w:bookmarkStart w:id="38" w:name="_Toc242550845"/>
       <w:r>
         <w:t>7.6 Usuario y producción: uso seguro y pruebas de los controles</w:t>
       </w:r>
@@ -21029,7 +21029,7 @@
           <w:noProof/>
         </w:rPr>
         <w:drawing>
-          <wp:inline distT="0" distB="0" distL="0" distR="0" wp14:anchorId="388E9FB4" wp14:editId="52919ED8">
+          <wp:inline distT="0" distB="0" distL="0" distR="0" wp14:anchorId="1CC47510" wp14:editId="37CB9CD6">
             <wp:extent cx="1685925" cy="457200"/>
             <wp:effectExtent l="0" t="0" r="0" b="0"/>
             <wp:docPr id="24" name="API sin token" descr="API sin token" title="API sin token"/>
@@ -21105,7 +21105,7 @@
           <w:noProof/>
         </w:rPr>
         <w:drawing>
-          <wp:inline distT="0" distB="0" distL="0" distR="0" wp14:anchorId="3787B83C" wp14:editId="6CB3A19F">
+          <wp:inline distT="0" distB="0" distL="0" distR="0" wp14:anchorId="194C9629" wp14:editId="2A296342">
             <wp:extent cx="5905500" cy="3495675"/>
             <wp:effectExtent l="0" t="0" r="0" b="0"/>
             <wp:docPr id="25" name="El cliente solo ve su cuenta" descr="El cliente solo ve su cuenta" title="El cliente solo ve su cuenta"/>
@@ -21181,7 +21181,7 @@
           <w:noProof/>
         </w:rPr>
         <w:drawing>
-          <wp:inline distT="0" distB="0" distL="0" distR="0" wp14:anchorId="424C4A12" wp14:editId="03C27161">
+          <wp:inline distT="0" distB="0" distL="0" distR="0" wp14:anchorId="10D1B5F1" wp14:editId="583DA5A8">
             <wp:extent cx="5905500" cy="3495675"/>
             <wp:effectExtent l="0" t="0" r="0" b="0"/>
             <wp:docPr id="26" name="Auditoría con el usuario de la aplicación" descr="Auditoría con el usuario de la aplicación" title="Auditoría con el usuario de la aplicación"/>
@@ -21250,7 +21250,7 @@
       <w:pPr>
         <w:pStyle w:val="Ttulo2"/>
       </w:pPr>
-      <w:bookmarkStart w:id="39" w:name="_Toc242548997"/>
+      <w:bookmarkStart w:id="39" w:name="_Toc242550846"/>
       <w:r>
         <w:t>7.7 Hallazgos y plan de mejora (autoevaluación)</w:t>
       </w:r>
@@ -21959,7 +21959,7 @@
                 <w:sz w:val="18"/>
                 <w:szCs w:val="18"/>
               </w:rPr>
-              <w:t xml:space="preserve"> y el trigger lo registra (CP-43). Sigue pendiente probar la restauración de respaldos.</w:t>
+              <w:t xml:space="preserve"> y el trigger lo registra (CP-43).</w:t>
             </w:r>
           </w:p>
         </w:tc>
@@ -21990,7 +21990,7 @@
                 <w:sz w:val="18"/>
                 <w:szCs w:val="18"/>
               </w:rPr>
-              <w:t>Bajo</w:t>
+              <w:t>—</w:t>
             </w:r>
           </w:p>
         </w:tc>
@@ -22021,16 +22021,7 @@
                 <w:sz w:val="18"/>
                 <w:szCs w:val="18"/>
               </w:rPr>
-              <w:t xml:space="preserve">Probar el </w:t>
-            </w:r>
-            <w:r>
-              <w:rPr>
-                <w:i/>
-                <w:iCs/>
-                <w:sz w:val="18"/>
-                <w:szCs w:val="18"/>
-              </w:rPr>
-              <w:t>restore</w:t>
+              <w:t>Resuelto</w:t>
             </w:r>
           </w:p>
         </w:tc>
@@ -22238,7 +22229,7 @@
                 <w:sz w:val="18"/>
                 <w:szCs w:val="18"/>
               </w:rPr>
-              <w:t xml:space="preserve">Los valores de demostración de </w:t>
+              <w:t xml:space="preserve">El archivo </w:t>
             </w:r>
             <w:r>
               <w:rPr>
@@ -22254,7 +22245,69 @@
                 <w:sz w:val="18"/>
                 <w:szCs w:val="18"/>
               </w:rPr>
-              <w:t xml:space="preserve"> (</w:t>
+              <w:t xml:space="preserve"> trae valores de demostración</w:t>
+            </w:r>
+          </w:p>
+        </w:tc>
+        <w:tc>
+          <w:tcPr>
+            <w:tcW w:w="2271" w:type="dxa"/>
+            <w:tcBorders>
+              <w:top w:val="single" w:sz="4" w:space="0" w:color="D9D2EA"/>
+              <w:left w:val="single" w:sz="4" w:space="0" w:color="D9D2EA"/>
+              <w:bottom w:val="single" w:sz="4" w:space="0" w:color="D9D2EA"/>
+              <w:right w:val="single" w:sz="4" w:space="0" w:color="D9D2EA"/>
+            </w:tcBorders>
+            <w:shd w:val="clear" w:color="auto" w:fill="F7F5FC"/>
+            <w:tcMar>
+              <w:top w:w="60" w:type="dxa"/>
+              <w:left w:w="90" w:type="dxa"/>
+              <w:bottom w:w="60" w:type="dxa"/>
+              <w:right w:w="90" w:type="dxa"/>
+            </w:tcMar>
+            <w:vAlign w:val="center"/>
+          </w:tcPr>
+          <w:p>
+            <w:pPr>
+              <w:spacing w:before="20" w:after="20"/>
+            </w:pPr>
+            <w:r>
+              <w:rPr>
+                <w:sz w:val="18"/>
+                <w:szCs w:val="18"/>
+              </w:rPr>
+              <w:t>Bajo (solo local)</w:t>
+            </w:r>
+          </w:p>
+        </w:tc>
+        <w:tc>
+          <w:tcPr>
+            <w:tcW w:w="3166" w:type="dxa"/>
+            <w:tcBorders>
+              <w:top w:val="single" w:sz="4" w:space="0" w:color="D9D2EA"/>
+              <w:left w:val="single" w:sz="4" w:space="0" w:color="D9D2EA"/>
+              <w:bottom w:val="single" w:sz="4" w:space="0" w:color="D9D2EA"/>
+              <w:right w:val="single" w:sz="4" w:space="0" w:color="D9D2EA"/>
+            </w:tcBorders>
+            <w:shd w:val="clear" w:color="auto" w:fill="F7F5FC"/>
+            <w:tcMar>
+              <w:top w:w="60" w:type="dxa"/>
+              <w:left w:w="90" w:type="dxa"/>
+              <w:bottom w:w="60" w:type="dxa"/>
+              <w:right w:w="90" w:type="dxa"/>
+            </w:tcMar>
+            <w:vAlign w:val="center"/>
+          </w:tcPr>
+          <w:p>
+            <w:pPr>
+              <w:spacing w:before="20" w:after="20"/>
+            </w:pPr>
+            <w:r>
+              <w:rPr>
+                <w:sz w:val="18"/>
+                <w:szCs w:val="18"/>
+              </w:rPr>
+              <w:t xml:space="preserve">Reemplazarlos al crear </w:t>
             </w:r>
             <w:r>
               <w:rPr>
@@ -22263,14 +22316,79 @@
                 <w:sz w:val="16"/>
                 <w:szCs w:val="16"/>
               </w:rPr>
-              <w:t>admin123</w:t>
-            </w:r>
-            <w:r>
-              <w:rPr>
-                <w:sz w:val="18"/>
-                <w:szCs w:val="18"/>
-              </w:rPr>
-              <w:t>)</w:t>
+              <w:t>.env</w:t>
+            </w:r>
+            <w:r>
+              <w:rPr>
+                <w:sz w:val="18"/>
+                <w:szCs w:val="18"/>
+              </w:rPr>
+              <w:t xml:space="preserve"> en cualquier ambiente compartido</w:t>
+            </w:r>
+          </w:p>
+        </w:tc>
+      </w:tr>
+      <w:tr>
+        <w:trPr>
+          <w:cantSplit/>
+        </w:trPr>
+        <w:tc>
+          <w:tcPr>
+            <w:tcW w:w="757" w:type="dxa"/>
+            <w:tcBorders>
+              <w:top w:val="single" w:sz="4" w:space="0" w:color="D9D2EA"/>
+              <w:left w:val="single" w:sz="4" w:space="0" w:color="D9D2EA"/>
+              <w:bottom w:val="single" w:sz="4" w:space="0" w:color="D9D2EA"/>
+              <w:right w:val="single" w:sz="4" w:space="0" w:color="D9D2EA"/>
+            </w:tcBorders>
+            <w:tcMar>
+              <w:top w:w="60" w:type="dxa"/>
+              <w:left w:w="90" w:type="dxa"/>
+              <w:bottom w:w="60" w:type="dxa"/>
+              <w:right w:w="90" w:type="dxa"/>
+            </w:tcMar>
+            <w:vAlign w:val="center"/>
+          </w:tcPr>
+          <w:p>
+            <w:pPr>
+              <w:spacing w:before="20" w:after="20"/>
+            </w:pPr>
+            <w:r>
+              <w:rPr>
+                <w:sz w:val="18"/>
+                <w:szCs w:val="18"/>
+              </w:rPr>
+              <w:t>H7</w:t>
+            </w:r>
+          </w:p>
+        </w:tc>
+        <w:tc>
+          <w:tcPr>
+            <w:tcW w:w="3166" w:type="dxa"/>
+            <w:tcBorders>
+              <w:top w:val="single" w:sz="4" w:space="0" w:color="D9D2EA"/>
+              <w:left w:val="single" w:sz="4" w:space="0" w:color="D9D2EA"/>
+              <w:bottom w:val="single" w:sz="4" w:space="0" w:color="D9D2EA"/>
+              <w:right w:val="single" w:sz="4" w:space="0" w:color="D9D2EA"/>
+            </w:tcBorders>
+            <w:tcMar>
+              <w:top w:w="60" w:type="dxa"/>
+              <w:left w:w="90" w:type="dxa"/>
+              <w:bottom w:w="60" w:type="dxa"/>
+              <w:right w:w="90" w:type="dxa"/>
+            </w:tcMar>
+            <w:vAlign w:val="center"/>
+          </w:tcPr>
+          <w:p>
+            <w:pPr>
+              <w:spacing w:before="20" w:after="20"/>
+            </w:pPr>
+            <w:r>
+              <w:rPr>
+                <w:sz w:val="18"/>
+                <w:szCs w:val="18"/>
+              </w:rPr>
+              <w:t>No hay una prueba documentada de restauración de respaldos (Azure PostgreSQL Flexible Server los genera automáticamente; el ambiente local no tiene respaldo programado)</w:t>
             </w:r>
           </w:p>
         </w:tc>
@@ -22283,25 +22401,24 @@
               <w:bottom w:val="single" w:sz="4" w:space="0" w:color="D9D2EA"/>
               <w:right w:val="single" w:sz="4" w:space="0" w:color="D9D2EA"/>
             </w:tcBorders>
-            <w:shd w:val="clear" w:color="auto" w:fill="F7F5FC"/>
-            <w:tcMar>
-              <w:top w:w="60" w:type="dxa"/>
-              <w:left w:w="90" w:type="dxa"/>
-              <w:bottom w:w="60" w:type="dxa"/>
-              <w:right w:w="90" w:type="dxa"/>
-            </w:tcMar>
-            <w:vAlign w:val="center"/>
-          </w:tcPr>
-          <w:p>
-            <w:pPr>
-              <w:spacing w:before="20" w:after="20"/>
-            </w:pPr>
-            <w:r>
-              <w:rPr>
-                <w:sz w:val="18"/>
-                <w:szCs w:val="18"/>
-              </w:rPr>
-              <w:t>Bajo (solo local)</w:t>
+            <w:tcMar>
+              <w:top w:w="60" w:type="dxa"/>
+              <w:left w:w="90" w:type="dxa"/>
+              <w:bottom w:w="60" w:type="dxa"/>
+              <w:right w:w="90" w:type="dxa"/>
+            </w:tcMar>
+            <w:vAlign w:val="center"/>
+          </w:tcPr>
+          <w:p>
+            <w:pPr>
+              <w:spacing w:before="20" w:after="20"/>
+            </w:pPr>
+            <w:r>
+              <w:rPr>
+                <w:sz w:val="18"/>
+                <w:szCs w:val="18"/>
+              </w:rPr>
+              <w:t>Medio</w:t>
             </w:r>
           </w:p>
         </w:tc>
@@ -22314,25 +22431,24 @@
               <w:bottom w:val="single" w:sz="4" w:space="0" w:color="D9D2EA"/>
               <w:right w:val="single" w:sz="4" w:space="0" w:color="D9D2EA"/>
             </w:tcBorders>
-            <w:shd w:val="clear" w:color="auto" w:fill="F7F5FC"/>
-            <w:tcMar>
-              <w:top w:w="60" w:type="dxa"/>
-              <w:left w:w="90" w:type="dxa"/>
-              <w:bottom w:w="60" w:type="dxa"/>
-              <w:right w:w="90" w:type="dxa"/>
-            </w:tcMar>
-            <w:vAlign w:val="center"/>
-          </w:tcPr>
-          <w:p>
-            <w:pPr>
-              <w:spacing w:before="20" w:after="20"/>
-            </w:pPr>
-            <w:r>
-              <w:rPr>
-                <w:sz w:val="18"/>
-                <w:szCs w:val="18"/>
-              </w:rPr>
-              <w:t xml:space="preserve">Reemplazarlos al crear </w:t>
+            <w:tcMar>
+              <w:top w:w="60" w:type="dxa"/>
+              <w:left w:w="90" w:type="dxa"/>
+              <w:bottom w:w="60" w:type="dxa"/>
+              <w:right w:w="90" w:type="dxa"/>
+            </w:tcMar>
+            <w:vAlign w:val="center"/>
+          </w:tcPr>
+          <w:p>
+            <w:pPr>
+              <w:spacing w:before="20" w:after="20"/>
+            </w:pPr>
+            <w:r>
+              <w:rPr>
+                <w:sz w:val="18"/>
+                <w:szCs w:val="18"/>
+              </w:rPr>
+              <w:t xml:space="preserve">Programar </w:t>
             </w:r>
             <w:r>
               <w:rPr>
@@ -22341,14 +22457,14 @@
                 <w:sz w:val="16"/>
                 <w:szCs w:val="16"/>
               </w:rPr>
-              <w:t>.env</w:t>
-            </w:r>
-            <w:r>
-              <w:rPr>
-                <w:sz w:val="18"/>
-                <w:szCs w:val="18"/>
-              </w:rPr>
-              <w:t xml:space="preserve"> en cualquier ambiente compartido</w:t>
+              <w:t>pg_dump</w:t>
+            </w:r>
+            <w:r>
+              <w:rPr>
+                <w:sz w:val="18"/>
+                <w:szCs w:val="18"/>
+              </w:rPr>
+              <w:t xml:space="preserve"> diario y documentar una prueba de restauración</w:t>
             </w:r>
           </w:p>
         </w:tc>
@@ -22364,7 +22480,7 @@
         <w:pStyle w:val="Ttulo1"/>
         <w:pageBreakBefore/>
       </w:pPr>
-      <w:bookmarkStart w:id="40" w:name="_Toc242548998"/>
+      <w:bookmarkStart w:id="40" w:name="_Toc242550847"/>
       <w:r>
         <w:t>8. Resultados</w:t>
       </w:r>
@@ -22374,7 +22490,7 @@
       <w:pPr>
         <w:pStyle w:val="Ttulo2"/>
       </w:pPr>
-      <w:bookmarkStart w:id="41" w:name="_Toc242548999"/>
+      <w:bookmarkStart w:id="41" w:name="_Toc242550848"/>
       <w:r>
         <w:t>Beneficios comprobados en el sistema</w:t>
       </w:r>
@@ -23226,7 +23342,7 @@
       <w:pPr>
         <w:pStyle w:val="Ttulo2"/>
       </w:pPr>
-      <w:bookmarkStart w:id="42" w:name="_Toc242549000"/>
+      <w:bookmarkStart w:id="42" w:name="_Toc242550849"/>
       <w:r>
         <w:t>Aporte a la transformación digital</w:t>
       </w:r>
@@ -23317,7 +23433,7 @@
         <w:pStyle w:val="Ttulo1"/>
         <w:pageBreakBefore/>
       </w:pPr>
-      <w:bookmarkStart w:id="43" w:name="_Toc242549001"/>
+      <w:bookmarkStart w:id="43" w:name="_Toc242550850"/>
       <w:r>
         <w:t>9. Conclusiones y anexos</w:t>
       </w:r>
@@ -23327,7 +23443,7 @@
       <w:pPr>
         <w:pStyle w:val="Ttulo2"/>
       </w:pPr>
-      <w:bookmarkStart w:id="44" w:name="_Toc242549002"/>
+      <w:bookmarkStart w:id="44" w:name="_Toc242550851"/>
       <w:r>
         <w:t>Conclusiones</w:t>
       </w:r>
@@ -23351,8 +23467,6 @@
       </w:r>
       <w:r>
         <w:tab/>
-      </w:r>
-      <w:r>
         <w:t>El cobro en campo quedó automatizado de punta a punta dentro del sistema: autenticación, consulta, validación, registro, recibo y reactivación del servicio. Alrededor de ese proceso, la aplicación web cubre la operación de los 5 roles de la empresa (cliente, técnico, secretaría, jefatura y administración) y funciona en celular y computadora sobre contenedores con los cuatro servicios sanos.</w:t>
       </w:r>
     </w:p>
@@ -23437,7 +23551,7 @@
       <w:pPr>
         <w:pStyle w:val="Ttulo2"/>
       </w:pPr>
-      <w:bookmarkStart w:id="45" w:name="_Toc242549003"/>
+      <w:bookmarkStart w:id="45" w:name="_Toc242550852"/>
       <w:r>
         <w:t>Anexo A. Respuestas reales de la API ante intentos indebidos</w:t>
       </w:r>
@@ -23668,7 +23782,7 @@
       <w:pPr>
         <w:pStyle w:val="Ttulo2"/>
       </w:pPr>
-      <w:bookmarkStart w:id="46" w:name="_Toc242549004"/>
+      <w:bookmarkStart w:id="46" w:name="_Toc242550853"/>
       <w:r>
         <w:t>Anexo B. Evidencia en la base de datos</w:t>
       </w:r>
@@ -23959,7 +24073,7 @@
       <w:pPr>
         <w:pStyle w:val="Ttulo2"/>
       </w:pPr>
-      <w:bookmarkStart w:id="47" w:name="_Toc242549005"/>
+      <w:bookmarkStart w:id="47" w:name="_Toc242550854"/>
       <w:r>
         <w:t>Anexo C. Archivos de evidencia</w:t>
       </w:r>
@@ -24491,7 +24605,7 @@
         <w:pStyle w:val="Ttulo1"/>
         <w:pageBreakBefore/>
       </w:pPr>
-      <w:bookmarkStart w:id="48" w:name="_Toc242549006"/>
+      <w:bookmarkStart w:id="48" w:name="_Toc242550855"/>
       <w:r>
         <w:t>10. Guion de la exposición (10 minutos)</w:t>
       </w:r>
@@ -25900,10 +26014,96 @@
 <file path=word/numbering.xml><?xml version="1.0" encoding="utf-8"?>
 <w:numbering xmlns:wpc="http://schemas.microsoft.com/office/word/2010/wordprocessingCanvas" xmlns:cx="http://schemas.microsoft.com/office/drawing/2014/chartex" xmlns:cx1="http://schemas.microsoft.com/office/drawing/2015/9/8/chartex" xmlns:cx2="http://schemas.microsoft.com/office/drawing/2015/10/21/chartex" xmlns:cx3="http://schemas.microsoft.com/office/drawing/2016/5/9/chartex" xmlns:cx4="http://schemas.microsoft.com/office/drawing/2016/5/10/chartex" xmlns:cx5="http://schemas.microsoft.com/office/drawing/2016/5/11/chartex" xmlns:cx6="http://schemas.microsoft.com/office/drawing/2016/5/12/chartex" xmlns:cx7="http://schemas.microsoft.com/office/drawing/2016/5/13/chartex" xmlns:cx8="http://schemas.microsoft.com/office/drawing/2016/5/14/chartex" xmlns:mc="http://schemas.openxmlformats.org/markup-compatibility/2006" xmlns:aink="http://schemas.microsoft.com/office/drawing/2016/ink" xmlns:am3d="http://schemas.microsoft.com/office/drawing/2017/model3d" xmlns:o="urn:schemas-microsoft-com:office:office" xmlns:oel="http://schemas.microsoft.com/office/2019/extlst" xmlns:r="http://schemas.openxmlformats.org/officeDocument/2006/relationships" xmlns:m="http://schemas.openxmlformats.org/officeDocument/2006/math" xmlns:v="urn:schemas-microsoft-com:vml" xmlns:wp14="http://schemas.microsoft.com/office/word/2010/wordprocessingDrawing" xmlns:wp="http://schemas.openxmlformats.org/drawingml/2006/wordprocessingDrawing" xmlns:w10="urn:schemas-microsoft-com:office:word" xmlns:w="http://schemas.openxmlformats.org/wordprocessingml/2006/main" xmlns:w14="http://schemas.microsoft.com/office/word/2010/wordml" xmlns:w15="http://schemas.microsoft.com/office/word/2012/wordml" xmlns:w16cex="http://schemas.microsoft.com/office/word/2018/wordml/cex" xmlns:w16cid="http://schemas.microsoft.com/office/word/2016/wordml/cid" xmlns:w16="http://schemas.microsoft.com/office/word/2018/wordml" xmlns:w16du="http://schemas.microsoft.com/office/word/2023/wordml/word16du" xmlns:w16sdtdh="http://schemas.microsoft.com/office/word/2020/wordml/sdtdatahash" xmlns:w16sdtfl="http://schemas.microsoft.com/office/word/2024/wordml/sdtformatlock" xmlns:w16se="http://schemas.microsoft.com/office/word/2015/wordml/symex" xmlns:wpg="http://schemas.microsoft.com/office/word/2010/wordprocessingGroup" xmlns:wpi="http://schemas.microsoft.com/office/word/2010/wordprocessingInk" xmlns:wne="http://schemas.microsoft.com/office/word/2006/wordml" xmlns:wps="http://schemas.microsoft.com/office/word/2010/wordprocessingShape" mc:Ignorable="w14 w15 w16se w16cid w16 w16cex w16sdtdh w16sdtfl w16du wp14">
   <w:abstractNum w:abstractNumId="0" w15:restartNumberingAfterBreak="0">
-    <w:nsid w:val="2CE92101"/>
+    <w:nsid w:val="06E93D44"/>
     <w:multiLevelType w:val="hybridMultilevel"/>
-    <w:tmpl w:val="91D64E0C"/>
-    <w:lvl w:ilvl="0" w:tplc="778242A0">
+    <w:tmpl w:val="4080D936"/>
+    <w:lvl w:ilvl="0" w:tplc="AC863C90" w:tentative="1">
+      <w:start w:val="1"/>
+      <w:numFmt w:val="bullet"/>
+      <w:lvlText w:val="●"/>
+      <w:lvlJc w:val="left"/>
+      <w:pPr>
+        <w:ind w:left="720" w:hanging="360"/>
+      </w:pPr>
+    </w:lvl>
+    <w:lvl w:ilvl="1" w:tplc="ED44D0A2" w:tentative="1">
+      <w:start w:val="1"/>
+      <w:numFmt w:val="bullet"/>
+      <w:lvlText w:val="○"/>
+      <w:lvlJc w:val="left"/>
+      <w:pPr>
+        <w:ind w:left="1440" w:hanging="360"/>
+      </w:pPr>
+    </w:lvl>
+    <w:lvl w:ilvl="2" w:tplc="5BF0844E" w:tentative="1">
+      <w:start w:val="1"/>
+      <w:numFmt w:val="bullet"/>
+      <w:lvlText w:val="■"/>
+      <w:lvlJc w:val="left"/>
+      <w:pPr>
+        <w:ind w:left="2160" w:hanging="360"/>
+      </w:pPr>
+    </w:lvl>
+    <w:lvl w:ilvl="3" w:tplc="21CCD14E" w:tentative="1">
+      <w:start w:val="1"/>
+      <w:numFmt w:val="bullet"/>
+      <w:lvlText w:val="●"/>
+      <w:lvlJc w:val="left"/>
+      <w:pPr>
+        <w:ind w:left="2880" w:hanging="360"/>
+      </w:pPr>
+    </w:lvl>
+    <w:lvl w:ilvl="4" w:tplc="4E244864" w:tentative="1">
+      <w:start w:val="1"/>
+      <w:numFmt w:val="bullet"/>
+      <w:lvlText w:val="○"/>
+      <w:lvlJc w:val="left"/>
+      <w:pPr>
+        <w:ind w:left="3600" w:hanging="360"/>
+      </w:pPr>
+    </w:lvl>
+    <w:lvl w:ilvl="5" w:tplc="7A8A5B0A" w:tentative="1">
+      <w:start w:val="1"/>
+      <w:numFmt w:val="bullet"/>
+      <w:lvlText w:val="■"/>
+      <w:lvlJc w:val="left"/>
+      <w:pPr>
+        <w:ind w:left="4320" w:hanging="360"/>
+      </w:pPr>
+    </w:lvl>
+    <w:lvl w:ilvl="6" w:tplc="0D2A5C76" w:tentative="1">
+      <w:start w:val="1"/>
+      <w:numFmt w:val="bullet"/>
+      <w:lvlText w:val="●"/>
+      <w:lvlJc w:val="left"/>
+      <w:pPr>
+        <w:ind w:left="5040" w:hanging="360"/>
+      </w:pPr>
+    </w:lvl>
+    <w:lvl w:ilvl="7" w:tplc="957A10BE" w:tentative="1">
+      <w:start w:val="1"/>
+      <w:numFmt w:val="bullet"/>
+      <w:lvlText w:val="●"/>
+      <w:lvlJc w:val="left"/>
+      <w:pPr>
+        <w:ind w:left="5760" w:hanging="360"/>
+      </w:pPr>
+    </w:lvl>
+    <w:lvl w:ilvl="8" w:tplc="96F6C286" w:tentative="1">
+      <w:start w:val="1"/>
+      <w:numFmt w:val="bullet"/>
+      <w:lvlText w:val="●"/>
+      <w:lvlJc w:val="left"/>
+      <w:pPr>
+        <w:ind w:left="6480" w:hanging="360"/>
+      </w:pPr>
+    </w:lvl>
+  </w:abstractNum>
+  <w:abstractNum w:abstractNumId="1" w15:restartNumberingAfterBreak="0">
+    <w:nsid w:val="3AA16A6E"/>
+    <w:multiLevelType w:val="hybridMultilevel"/>
+    <w:tmpl w:val="BAE6AEB0"/>
+    <w:lvl w:ilvl="0" w:tplc="2658761E">
       <w:start w:val="1"/>
       <w:numFmt w:val="bullet"/>
       <w:lvlText w:val="•"/>
@@ -25912,7 +26112,7 @@
         <w:ind w:left="540" w:hanging="270"/>
       </w:pPr>
     </w:lvl>
-    <w:lvl w:ilvl="1" w:tplc="427ACCA6" w:tentative="1">
+    <w:lvl w:ilvl="1" w:tplc="C0D06628" w:tentative="1">
       <w:start w:val="1"/>
       <w:numFmt w:val="bullet"/>
       <w:lvlText w:val="◦"/>
@@ -25921,133 +26121,47 @@
         <w:ind w:left="1080" w:hanging="270"/>
       </w:pPr>
     </w:lvl>
-    <w:lvl w:ilvl="2" w:tplc="B70487DC">
+    <w:lvl w:ilvl="2" w:tplc="82BA9C00">
       <w:numFmt w:val="decimal"/>
       <w:lvlText w:val=""/>
       <w:lvlJc w:val="left"/>
     </w:lvl>
-    <w:lvl w:ilvl="3" w:tplc="A76EB2E6">
+    <w:lvl w:ilvl="3" w:tplc="5B52F198">
       <w:numFmt w:val="decimal"/>
       <w:lvlText w:val=""/>
       <w:lvlJc w:val="left"/>
     </w:lvl>
-    <w:lvl w:ilvl="4" w:tplc="9DEE4182">
+    <w:lvl w:ilvl="4" w:tplc="F1D04990">
       <w:numFmt w:val="decimal"/>
       <w:lvlText w:val=""/>
       <w:lvlJc w:val="left"/>
     </w:lvl>
-    <w:lvl w:ilvl="5" w:tplc="9F62D96C">
+    <w:lvl w:ilvl="5" w:tplc="7A3E416A">
       <w:numFmt w:val="decimal"/>
       <w:lvlText w:val=""/>
       <w:lvlJc w:val="left"/>
     </w:lvl>
-    <w:lvl w:ilvl="6" w:tplc="C59A3EA2">
+    <w:lvl w:ilvl="6" w:tplc="D938D6CA">
       <w:numFmt w:val="decimal"/>
       <w:lvlText w:val=""/>
       <w:lvlJc w:val="left"/>
     </w:lvl>
-    <w:lvl w:ilvl="7" w:tplc="520018D4">
+    <w:lvl w:ilvl="7" w:tplc="95A66D08">
       <w:numFmt w:val="decimal"/>
       <w:lvlText w:val=""/>
       <w:lvlJc w:val="left"/>
     </w:lvl>
-    <w:lvl w:ilvl="8" w:tplc="F152A196">
+    <w:lvl w:ilvl="8" w:tplc="68CE2EE8">
       <w:numFmt w:val="decimal"/>
       <w:lvlText w:val=""/>
       <w:lvlJc w:val="left"/>
     </w:lvl>
   </w:abstractNum>
-  <w:abstractNum w:abstractNumId="1" w15:restartNumberingAfterBreak="0">
-    <w:nsid w:val="6F6C4C29"/>
+  <w:abstractNum w:abstractNumId="2" w15:restartNumberingAfterBreak="0">
+    <w:nsid w:val="5AEB3759"/>
     <w:multiLevelType w:val="hybridMultilevel"/>
-    <w:tmpl w:val="446097CC"/>
-    <w:lvl w:ilvl="0" w:tplc="196CB1AE" w:tentative="1">
-      <w:start w:val="1"/>
-      <w:numFmt w:val="bullet"/>
-      <w:lvlText w:val="●"/>
-      <w:lvlJc w:val="left"/>
-      <w:pPr>
-        <w:ind w:left="720" w:hanging="360"/>
-      </w:pPr>
-    </w:lvl>
-    <w:lvl w:ilvl="1" w:tplc="E95E4AE6" w:tentative="1">
-      <w:start w:val="1"/>
-      <w:numFmt w:val="bullet"/>
-      <w:lvlText w:val="○"/>
-      <w:lvlJc w:val="left"/>
-      <w:pPr>
-        <w:ind w:left="1440" w:hanging="360"/>
-      </w:pPr>
-    </w:lvl>
-    <w:lvl w:ilvl="2" w:tplc="DF6E0D1A" w:tentative="1">
-      <w:start w:val="1"/>
-      <w:numFmt w:val="bullet"/>
-      <w:lvlText w:val="■"/>
-      <w:lvlJc w:val="left"/>
-      <w:pPr>
-        <w:ind w:left="2160" w:hanging="360"/>
-      </w:pPr>
-    </w:lvl>
-    <w:lvl w:ilvl="3" w:tplc="FA74C208" w:tentative="1">
-      <w:start w:val="1"/>
-      <w:numFmt w:val="bullet"/>
-      <w:lvlText w:val="●"/>
-      <w:lvlJc w:val="left"/>
-      <w:pPr>
-        <w:ind w:left="2880" w:hanging="360"/>
-      </w:pPr>
-    </w:lvl>
-    <w:lvl w:ilvl="4" w:tplc="5E6A87B6" w:tentative="1">
-      <w:start w:val="1"/>
-      <w:numFmt w:val="bullet"/>
-      <w:lvlText w:val="○"/>
-      <w:lvlJc w:val="left"/>
-      <w:pPr>
-        <w:ind w:left="3600" w:hanging="360"/>
-      </w:pPr>
-    </w:lvl>
-    <w:lvl w:ilvl="5" w:tplc="DF288DAA" w:tentative="1">
-      <w:start w:val="1"/>
-      <w:numFmt w:val="bullet"/>
-      <w:lvlText w:val="■"/>
-      <w:lvlJc w:val="left"/>
-      <w:pPr>
-        <w:ind w:left="4320" w:hanging="360"/>
-      </w:pPr>
-    </w:lvl>
-    <w:lvl w:ilvl="6" w:tplc="18C0C708" w:tentative="1">
-      <w:start w:val="1"/>
-      <w:numFmt w:val="bullet"/>
-      <w:lvlText w:val="●"/>
-      <w:lvlJc w:val="left"/>
-      <w:pPr>
-        <w:ind w:left="5040" w:hanging="360"/>
-      </w:pPr>
-    </w:lvl>
-    <w:lvl w:ilvl="7" w:tplc="1A0C7DF6" w:tentative="1">
-      <w:start w:val="1"/>
-      <w:numFmt w:val="bullet"/>
-      <w:lvlText w:val="●"/>
-      <w:lvlJc w:val="left"/>
-      <w:pPr>
-        <w:ind w:left="5760" w:hanging="360"/>
-      </w:pPr>
-    </w:lvl>
-    <w:lvl w:ilvl="8" w:tplc="E9BA183E" w:tentative="1">
-      <w:start w:val="1"/>
-      <w:numFmt w:val="bullet"/>
-      <w:lvlText w:val="●"/>
-      <w:lvlJc w:val="left"/>
-      <w:pPr>
-        <w:ind w:left="6480" w:hanging="360"/>
-      </w:pPr>
-    </w:lvl>
-  </w:abstractNum>
-  <w:abstractNum w:abstractNumId="2" w15:restartNumberingAfterBreak="0">
-    <w:nsid w:val="745E0987"/>
-    <w:multiLevelType w:val="hybridMultilevel"/>
-    <w:tmpl w:val="65422112"/>
-    <w:lvl w:ilvl="0" w:tplc="36B2C494" w:tentative="1">
+    <w:tmpl w:val="42A41810"/>
+    <w:lvl w:ilvl="0" w:tplc="85DCB99E" w:tentative="1">
       <w:start w:val="1"/>
       <w:numFmt w:val="decimal"/>
       <w:lvlText w:val="%1."/>
@@ -26056,7 +26170,7 @@
         <w:ind w:left="540" w:hanging="340"/>
       </w:pPr>
     </w:lvl>
-    <w:lvl w:ilvl="1" w:tplc="EF0099F6" w:tentative="1">
+    <w:lvl w:ilvl="1" w:tplc="827E8C74" w:tentative="1">
       <w:start w:val="1"/>
       <w:numFmt w:val="lowerLetter"/>
       <w:lvlText w:val="%2)"/>
@@ -26065,50 +26179,50 @@
         <w:ind w:left="1080" w:hanging="340"/>
       </w:pPr>
     </w:lvl>
-    <w:lvl w:ilvl="2" w:tplc="0E60D876">
+    <w:lvl w:ilvl="2" w:tplc="B4CEBDCA">
       <w:numFmt w:val="decimal"/>
       <w:lvlText w:val=""/>
       <w:lvlJc w:val="left"/>
     </w:lvl>
-    <w:lvl w:ilvl="3" w:tplc="C0702F2E">
+    <w:lvl w:ilvl="3" w:tplc="8942373C">
       <w:numFmt w:val="decimal"/>
       <w:lvlText w:val=""/>
       <w:lvlJc w:val="left"/>
     </w:lvl>
-    <w:lvl w:ilvl="4" w:tplc="77A67A50">
+    <w:lvl w:ilvl="4" w:tplc="60146BB2">
       <w:numFmt w:val="decimal"/>
       <w:lvlText w:val=""/>
       <w:lvlJc w:val="left"/>
     </w:lvl>
-    <w:lvl w:ilvl="5" w:tplc="B9C69324">
+    <w:lvl w:ilvl="5" w:tplc="07383CA0">
       <w:numFmt w:val="decimal"/>
       <w:lvlText w:val=""/>
       <w:lvlJc w:val="left"/>
     </w:lvl>
-    <w:lvl w:ilvl="6" w:tplc="56101860">
+    <w:lvl w:ilvl="6" w:tplc="51FEF8D2">
       <w:numFmt w:val="decimal"/>
       <w:lvlText w:val=""/>
       <w:lvlJc w:val="left"/>
     </w:lvl>
-    <w:lvl w:ilvl="7" w:tplc="A322F350">
+    <w:lvl w:ilvl="7" w:tplc="5BE84CAA">
       <w:numFmt w:val="decimal"/>
       <w:lvlText w:val=""/>
       <w:lvlJc w:val="left"/>
     </w:lvl>
-    <w:lvl w:ilvl="8" w:tplc="D632D98C">
+    <w:lvl w:ilvl="8" w:tplc="7BEC7D22">
       <w:numFmt w:val="decimal"/>
       <w:lvlText w:val=""/>
       <w:lvlJc w:val="left"/>
     </w:lvl>
   </w:abstractNum>
-  <w:num w:numId="1" w16cid:durableId="786848346">
-    <w:abstractNumId w:val="1"/>
+  <w:num w:numId="1" w16cid:durableId="536508612">
+    <w:abstractNumId w:val="0"/>
     <w:lvlOverride w:ilvl="0">
       <w:startOverride w:val="1"/>
     </w:lvlOverride>
   </w:num>
-  <w:num w:numId="2" w16cid:durableId="1446655316">
-    <w:abstractNumId w:val="0"/>
+  <w:num w:numId="2" w16cid:durableId="2113623653">
+    <w:abstractNumId w:val="1"/>
     <w:lvlOverride w:ilvl="0">
       <w:startOverride w:val="1"/>
     </w:lvlOverride>
@@ -26754,7 +26868,7 @@
     <w:autoRedefine/>
     <w:uiPriority w:val="39"/>
     <w:unhideWhenUsed/>
-    <w:rsid w:val="0089785D"/>
+    <w:rsid w:val="009B29F3"/>
     <w:pPr>
       <w:spacing w:after="100"/>
     </w:pPr>
@@ -26766,7 +26880,7 @@
     <w:autoRedefine/>
     <w:uiPriority w:val="39"/>
     <w:unhideWhenUsed/>
-    <w:rsid w:val="0089785D"/>
+    <w:rsid w:val="009B29F3"/>
     <w:pPr>
       <w:spacing w:after="100"/>
       <w:ind w:left="210"/>

</xml_diff>